<commit_message>
testing all project inculding (manual and unit tesing) and also correct frontend lint programs
</commit_message>
<xml_diff>
--- a/PDF/Black-Book Legal_AI.docx
+++ b/PDF/Black-Book Legal_AI.docx
@@ -2899,7 +2899,7 @@
         <w:spacing w:line="360" w:lineRule="auto"/>
         <w:ind w:right="43"/>
         <w:contextualSpacing/>
-        <w:jc w:val="center"/>
+        <w:jc w:val="both"/>
         <w:rPr>
           <w:sz w:val="24"/>
         </w:rPr>
@@ -2910,18 +2910,7 @@
         <w:spacing w:line="360" w:lineRule="auto"/>
         <w:ind w:right="43"/>
         <w:contextualSpacing/>
-        <w:jc w:val="center"/>
-        <w:rPr>
-          <w:sz w:val="24"/>
-        </w:rPr>
-      </w:pPr>
-    </w:p>
-    <w:p>
-      <w:pPr>
-        <w:spacing w:line="360" w:lineRule="auto"/>
-        <w:ind w:right="43"/>
-        <w:contextualSpacing/>
-        <w:jc w:val="center"/>
+        <w:jc w:val="both"/>
         <w:rPr>
           <w:sz w:val="24"/>
         </w:rPr>
@@ -4001,7 +3990,7 @@
               <w:keepLines w:val="0"/>
               <w:suppressLineNumbers w:val="0"/>
               <w:spacing w:before="0" w:beforeAutospacing="0" w:after="173" w:afterAutospacing="0" w:line="259" w:lineRule="auto"/>
-              <w:ind w:left="446" w:right="58"/>
+              <w:ind w:left="0" w:right="58"/>
               <w:contextualSpacing/>
               <w:jc w:val="center"/>
               <w:rPr>
@@ -4019,7 +4008,154 @@
                 <w:sz w:val="24"/>
                 <w:szCs w:val="24"/>
               </w:rPr>
-              <w:t>Head of Department                                                                                                           Computer Engineering                                                                                                                         Department</w:t>
+              <w:t>Head of Department                                                                                                     Computer</w:t>
+            </w:r>
+            <w:r>
+              <w:rPr>
+                <w:rFonts w:hint="default" w:cs="Times New Roman"/>
+                <w:b/>
+                <w:sz w:val="24"/>
+                <w:szCs w:val="24"/>
+                <w:lang w:val="en-IN"/>
+              </w:rPr>
+              <w:t xml:space="preserve"> </w:t>
+            </w:r>
+            <w:r>
+              <w:rPr>
+                <w:rFonts w:hint="default" w:ascii="Times New Roman" w:hAnsi="Times New Roman" w:cs="Times New Roman"/>
+                <w:b/>
+                <w:sz w:val="24"/>
+                <w:szCs w:val="24"/>
+              </w:rPr>
+              <w:t>Engineering                                                                                                                         Department</w:t>
+            </w:r>
+          </w:p>
+        </w:tc>
+      </w:tr>
+      <w:tr>
+        <w:tblPrEx>
+          <w:tblBorders>
+            <w:top w:val="single" w:color="auto" w:sz="4" w:space="0"/>
+            <w:left w:val="single" w:color="auto" w:sz="4" w:space="0"/>
+            <w:bottom w:val="single" w:color="auto" w:sz="4" w:space="0"/>
+            <w:right w:val="single" w:color="auto" w:sz="4" w:space="0"/>
+            <w:insideH w:val="single" w:color="auto" w:sz="4" w:space="0"/>
+            <w:insideV w:val="single" w:color="auto" w:sz="4" w:space="0"/>
+          </w:tblBorders>
+          <w:tblCellMar>
+            <w:top w:w="0" w:type="dxa"/>
+            <w:left w:w="108" w:type="dxa"/>
+            <w:bottom w:w="0" w:type="dxa"/>
+            <w:right w:w="108" w:type="dxa"/>
+          </w:tblCellMar>
+        </w:tblPrEx>
+        <w:tc>
+          <w:tcPr>
+            <w:tcW w:w="3321" w:type="dxa"/>
+            <w:tcBorders>
+              <w:top w:val="nil"/>
+              <w:left w:val="nil"/>
+              <w:bottom w:val="nil"/>
+              <w:right w:val="nil"/>
+            </w:tcBorders>
+          </w:tcPr>
+          <w:p>
+            <w:pPr>
+              <w:keepNext w:val="0"/>
+              <w:keepLines w:val="0"/>
+              <w:suppressLineNumbers w:val="0"/>
+              <w:spacing w:before="0" w:beforeAutospacing="0" w:after="173" w:afterAutospacing="0" w:line="259" w:lineRule="auto"/>
+              <w:ind w:left="0" w:right="58"/>
+              <w:contextualSpacing/>
+              <w:jc w:val="center"/>
+              <w:rPr>
+                <w:rFonts w:hint="default" w:ascii="Times New Roman" w:hAnsi="Times New Roman" w:cs="Times New Roman"/>
+                <w:b/>
+                <w:sz w:val="24"/>
+                <w:szCs w:val="24"/>
+              </w:rPr>
+            </w:pPr>
+          </w:p>
+        </w:tc>
+        <w:tc>
+          <w:tcPr>
+            <w:tcW w:w="3322" w:type="dxa"/>
+            <w:tcBorders>
+              <w:top w:val="nil"/>
+              <w:left w:val="nil"/>
+              <w:bottom w:val="nil"/>
+              <w:right w:val="nil"/>
+            </w:tcBorders>
+          </w:tcPr>
+          <w:p>
+            <w:pPr>
+              <w:keepNext w:val="0"/>
+              <w:keepLines w:val="0"/>
+              <w:suppressLineNumbers w:val="0"/>
+              <w:spacing w:before="0" w:beforeAutospacing="0" w:after="173" w:afterAutospacing="0" w:line="259" w:lineRule="auto"/>
+              <w:ind w:left="0" w:right="58"/>
+              <w:contextualSpacing/>
+              <w:jc w:val="center"/>
+              <w:rPr>
+                <w:rFonts w:hint="default" w:ascii="Times New Roman" w:hAnsi="Times New Roman" w:cs="Times New Roman"/>
+                <w:b/>
+                <w:sz w:val="24"/>
+                <w:szCs w:val="24"/>
+              </w:rPr>
+            </w:pPr>
+          </w:p>
+        </w:tc>
+        <w:tc>
+          <w:tcPr>
+            <w:tcW w:w="3322" w:type="dxa"/>
+            <w:tcBorders>
+              <w:top w:val="nil"/>
+              <w:left w:val="nil"/>
+              <w:bottom w:val="nil"/>
+              <w:right w:val="nil"/>
+            </w:tcBorders>
+          </w:tcPr>
+          <w:p>
+            <w:pPr>
+              <w:keepNext w:val="0"/>
+              <w:keepLines w:val="0"/>
+              <w:suppressLineNumbers w:val="0"/>
+              <w:spacing w:before="0" w:beforeAutospacing="0" w:after="173" w:afterAutospacing="0" w:line="259" w:lineRule="auto"/>
+              <w:ind w:left="0" w:right="58"/>
+              <w:contextualSpacing/>
+              <w:jc w:val="center"/>
+              <w:rPr>
+                <w:rFonts w:hint="default" w:ascii="Times New Roman" w:hAnsi="Times New Roman" w:cs="Times New Roman"/>
+                <w:b/>
+                <w:sz w:val="24"/>
+                <w:szCs w:val="24"/>
+              </w:rPr>
+            </w:pPr>
+          </w:p>
+          <w:p>
+            <w:pPr>
+              <w:keepNext w:val="0"/>
+              <w:keepLines w:val="0"/>
+              <w:suppressLineNumbers w:val="0"/>
+              <w:spacing w:before="0" w:beforeAutospacing="0" w:after="173" w:afterAutospacing="0" w:line="259" w:lineRule="auto"/>
+              <w:ind w:left="0" w:right="58"/>
+              <w:contextualSpacing/>
+              <w:jc w:val="center"/>
+              <w:rPr>
+                <w:rFonts w:hint="default" w:ascii="Times New Roman" w:hAnsi="Times New Roman" w:cs="Times New Roman"/>
+                <w:b/>
+                <w:sz w:val="24"/>
+                <w:szCs w:val="24"/>
+              </w:rPr>
+            </w:pPr>
+            <w:r>
+              <w:rPr>
+                <w:rFonts w:hint="default" w:ascii="Times New Roman" w:hAnsi="Times New Roman" w:cs="Times New Roman"/>
+                <w:b/>
+                <w:sz w:val="24"/>
+                <w:szCs w:val="24"/>
+              </w:rPr>
+              <w:t>External Sign</w:t>
             </w:r>
           </w:p>
         </w:tc>
@@ -4028,32 +4164,8 @@
     <w:p>
       <w:pPr>
         <w:spacing w:after="173" w:line="259" w:lineRule="auto"/>
-        <w:ind w:left="446" w:right="58"/>
+        <w:ind w:right="58"/>
         <w:contextualSpacing/>
-        <w:rPr>
-          <w:b/>
-          <w:sz w:val="24"/>
-        </w:rPr>
-      </w:pPr>
-      <w:r>
-        <w:rPr>
-          <w:b/>
-          <w:sz w:val="24"/>
-        </w:rPr>
-        <w:t xml:space="preserve">                     </w:t>
-      </w:r>
-    </w:p>
-    <w:p>
-      <w:pPr>
-        <w:widowControl/>
-        <w:pBdr>
-          <w:top w:val="none" w:color="auto" w:sz="0" w:space="0"/>
-          <w:left w:val="none" w:color="auto" w:sz="0" w:space="0"/>
-          <w:bottom w:val="none" w:color="auto" w:sz="0" w:space="0"/>
-          <w:right w:val="none" w:color="auto" w:sz="0" w:space="0"/>
-          <w:between w:val="none" w:color="auto" w:sz="0" w:space="0"/>
-        </w:pBdr>
-        <w:jc w:val="both"/>
         <w:rPr>
           <w:b/>
           <w:bCs/>
@@ -4499,8 +4611,10 @@
       <w:pPr>
         <w:spacing w:after="179" w:line="259" w:lineRule="auto"/>
         <w:rPr>
-          <w:sz w:val="24"/>
-          <w:szCs w:val="24"/>
+          <w:rFonts w:hint="default"/>
+          <w:sz w:val="24"/>
+          <w:szCs w:val="24"/>
+          <w:lang w:val="en-IN"/>
         </w:rPr>
         <w:sectPr>
           <w:footerReference r:id="rId9" w:type="default"/>
@@ -4530,7 +4644,48 @@
           <w:sz w:val="24"/>
           <w:szCs w:val="24"/>
         </w:rPr>
-        <w:t xml:space="preserve">       /       /2025</w:t>
+        <w:t xml:space="preserve">   /  </w:t>
+      </w:r>
+      <w:r>
+        <w:rPr>
+          <w:rFonts w:hint="default"/>
+          <w:sz w:val="24"/>
+          <w:szCs w:val="24"/>
+          <w:lang w:val="en-IN"/>
+        </w:rPr>
+        <w:t xml:space="preserve">  </w:t>
+      </w:r>
+      <w:r>
+        <w:rPr>
+          <w:sz w:val="24"/>
+          <w:szCs w:val="24"/>
+        </w:rPr>
+        <w:t>/</w:t>
+      </w:r>
+      <w:r>
+        <w:rPr>
+          <w:rFonts w:hint="default"/>
+          <w:sz w:val="24"/>
+          <w:szCs w:val="24"/>
+          <w:lang w:val="en-IN"/>
+        </w:rPr>
+        <w:t xml:space="preserve"> </w:t>
+      </w:r>
+      <w:r>
+        <w:rPr>
+          <w:sz w:val="24"/>
+          <w:szCs w:val="24"/>
+        </w:rPr>
+        <w:t>202</w:t>
+      </w:r>
+      <w:r>
+        <w:rPr>
+          <w:rFonts w:hint="default"/>
+          <w:sz w:val="24"/>
+          <w:szCs w:val="24"/>
+          <w:lang w:val="en-IN"/>
+        </w:rPr>
+        <w:t>6</w:t>
       </w:r>
     </w:p>
     <w:p>
@@ -25123,6 +25278,7 @@
         <w:keepLines w:val="0"/>
         <w:widowControl/>
         <w:numPr>
+          <w:ilvl w:val="0"/>
           <w:numId w:val="0"/>
         </w:numPr>
         <w:suppressLineNumbers w:val="0"/>
@@ -27158,6 +27314,7 @@
         <w:keepLines w:val="0"/>
         <w:widowControl/>
         <w:numPr>
+          <w:ilvl w:val="0"/>
           <w:numId w:val="0"/>
         </w:numPr>
         <w:suppressLineNumbers w:val="0"/>
@@ -28063,47 +28220,6 @@
         <w:spacing w:line="360" w:lineRule="auto"/>
         <w:jc w:val="both"/>
         <w:rPr>
-          <w:rFonts w:hint="default" w:eastAsiaTheme="minorHAnsi"/>
-          <w:b/>
-          <w:kern w:val="2"/>
-          <w:sz w:val="28"/>
-          <w:szCs w:val="28"/>
-          <w:lang w:val="en-IN" w:eastAsia="en-US"/>
-          <w14:ligatures w14:val="standardContextual"/>
-        </w:rPr>
-      </w:pPr>
-      <w:r>
-        <w:rPr>
-          <w:rFonts w:hint="default" w:ascii="Times New Roman" w:hAnsi="Times New Roman" w:cs="Times New Roman"/>
-          <w:b/>
-          <w:bCs/>
-          <w:color w:val="000000" w:themeColor="text1"/>
-          <w:sz w:val="24"/>
-          <w:szCs w:val="24"/>
-          <w14:textFill>
-            <w14:solidFill>
-              <w14:schemeClr w14:val="tx1"/>
-            </w14:solidFill>
-          </w14:textFill>
-        </w:rPr>
-        <w:t>In Summary:</w:t>
-      </w:r>
-      <w:r>
-        <w:rPr>
-          <w:rFonts w:hint="default" w:ascii="Times New Roman" w:hAnsi="Times New Roman" w:cs="Times New Roman"/>
-          <w:color w:val="000000" w:themeColor="text1"/>
-          <w:sz w:val="24"/>
-          <w:szCs w:val="24"/>
-          <w14:textFill>
-            <w14:solidFill>
-              <w14:schemeClr w14:val="tx1"/>
-            </w14:solidFill>
-          </w14:textFill>
-        </w:rPr>
-        <w:t xml:space="preserve"> This diagram clearly illustrates a system where a human user drives the interaction, but the chatbot heavily relies on two external services (a Legal Database and a Translator) to successfully deliver complex features like answering legal queries, generating documents, and communicating in multiple languages</w:t>
-      </w:r>
-      <w:r>
-        <w:rPr>
           <w:rFonts w:hint="default" w:cs="Times New Roman"/>
           <w:color w:val="000000" w:themeColor="text1"/>
           <w:sz w:val="24"/>
@@ -28115,8 +28231,654 @@
             </w14:solidFill>
           </w14:textFill>
         </w:rPr>
+      </w:pPr>
+      <w:r>
+        <w:rPr>
+          <w:rFonts w:hint="default" w:ascii="Times New Roman" w:hAnsi="Times New Roman" w:cs="Times New Roman"/>
+          <w:b/>
+          <w:bCs/>
+          <w:color w:val="000000" w:themeColor="text1"/>
+          <w:sz w:val="24"/>
+          <w:szCs w:val="24"/>
+          <w14:textFill>
+            <w14:solidFill>
+              <w14:schemeClr w14:val="tx1"/>
+            </w14:solidFill>
+          </w14:textFill>
+        </w:rPr>
+        <w:t>In Summary:</w:t>
+      </w:r>
+      <w:r>
+        <w:rPr>
+          <w:rFonts w:hint="default" w:ascii="Times New Roman" w:hAnsi="Times New Roman" w:cs="Times New Roman"/>
+          <w:color w:val="000000" w:themeColor="text1"/>
+          <w:sz w:val="24"/>
+          <w:szCs w:val="24"/>
+          <w14:textFill>
+            <w14:solidFill>
+              <w14:schemeClr w14:val="tx1"/>
+            </w14:solidFill>
+          </w14:textFill>
+        </w:rPr>
+        <w:t xml:space="preserve"> This diagram clearly illustrates a system where a human user drives the interaction, but the chatbot heavily relies on two external services (a Legal Database and a Translator) to successfully deliver complex features like answering legal queries, generating documents, and communicating in multiple languages</w:t>
+      </w:r>
+      <w:r>
+        <w:rPr>
+          <w:rFonts w:hint="default" w:cs="Times New Roman"/>
+          <w:color w:val="000000" w:themeColor="text1"/>
+          <w:sz w:val="24"/>
+          <w:szCs w:val="24"/>
+          <w:lang w:val="en-IN"/>
+          <w14:textFill>
+            <w14:solidFill>
+              <w14:schemeClr w14:val="tx1"/>
+            </w14:solidFill>
+          </w14:textFill>
+        </w:rPr>
         <w:t>.</w:t>
       </w:r>
+    </w:p>
+    <w:p>
+      <w:pPr>
+        <w:pStyle w:val="13"/>
+        <w:keepNext w:val="0"/>
+        <w:keepLines w:val="0"/>
+        <w:widowControl/>
+        <w:suppressLineNumbers w:val="0"/>
+        <w:spacing w:line="360" w:lineRule="auto"/>
+        <w:jc w:val="both"/>
+        <w:rPr>
+          <w:rFonts w:hint="default" w:cs="Times New Roman"/>
+          <w:b/>
+          <w:bCs/>
+          <w:color w:val="000000" w:themeColor="text1"/>
+          <w:sz w:val="28"/>
+          <w:szCs w:val="28"/>
+          <w:lang w:val="en-IN"/>
+          <w14:textFill>
+            <w14:solidFill>
+              <w14:schemeClr w14:val="tx1"/>
+            </w14:solidFill>
+          </w14:textFill>
+        </w:rPr>
+      </w:pPr>
+      <w:r>
+        <w:rPr>
+          <w:rFonts w:hint="default" w:cs="Times New Roman"/>
+          <w:b/>
+          <w:bCs/>
+          <w:color w:val="000000" w:themeColor="text1"/>
+          <w:sz w:val="28"/>
+          <w:szCs w:val="28"/>
+          <w:lang w:val="en-IN"/>
+          <w14:textFill>
+            <w14:solidFill>
+              <w14:schemeClr w14:val="tx1"/>
+            </w14:solidFill>
+          </w14:textFill>
+        </w:rPr>
+        <w:t>3.4 Architecture Diagram:</w:t>
+      </w:r>
+    </w:p>
+    <w:p>
+      <w:pPr>
+        <w:pStyle w:val="13"/>
+        <w:keepNext w:val="0"/>
+        <w:keepLines w:val="0"/>
+        <w:widowControl/>
+        <w:suppressLineNumbers w:val="0"/>
+        <w:spacing w:before="0" w:beforeAutospacing="1" w:after="0" w:afterAutospacing="1" w:line="360" w:lineRule="auto"/>
+        <w:ind w:left="0" w:right="0"/>
+        <w:jc w:val="both"/>
+        <w:rPr>
+          <w:rFonts w:hint="default"/>
+          <w:b/>
+          <w:bCs/>
+          <w:lang w:val="en-IN"/>
+        </w:rPr>
+      </w:pPr>
+      <w:r>
+        <w:rPr>
+          <w:b/>
+          <w:bCs/>
+        </w:rPr>
+        <w:t>1. Presentation Layer (User Interface)</w:t>
+      </w:r>
+      <w:r>
+        <w:rPr>
+          <w:rFonts w:hint="default"/>
+          <w:b/>
+          <w:bCs/>
+          <w:lang w:val="en-IN"/>
+        </w:rPr>
+        <w:t>:</w:t>
+      </w:r>
+    </w:p>
+    <w:p>
+      <w:pPr>
+        <w:pStyle w:val="13"/>
+        <w:keepNext w:val="0"/>
+        <w:keepLines w:val="0"/>
+        <w:widowControl/>
+        <w:suppressLineNumbers w:val="0"/>
+        <w:spacing w:before="0" w:beforeAutospacing="1" w:after="0" w:afterAutospacing="1" w:line="360" w:lineRule="auto"/>
+        <w:ind w:left="0" w:right="0"/>
+        <w:jc w:val="both"/>
+      </w:pPr>
+      <w:r>
+        <w:t>This is where the user interacts with the system. It is designed to be highly accessible.</w:t>
+      </w:r>
+    </w:p>
+    <w:p>
+      <w:pPr>
+        <w:pStyle w:val="13"/>
+        <w:keepNext w:val="0"/>
+        <w:keepLines w:val="0"/>
+        <w:widowControl/>
+        <w:suppressLineNumbers w:val="0"/>
+        <w:spacing w:before="0" w:beforeAutospacing="1" w:after="0" w:afterAutospacing="1" w:line="360" w:lineRule="auto"/>
+        <w:ind w:left="0" w:right="0"/>
+        <w:jc w:val="both"/>
+      </w:pPr>
+      <w:r>
+        <w:t>Inputs: Users can submit queries via Text Input or Voice Input.</w:t>
+      </w:r>
+    </w:p>
+    <w:p>
+      <w:pPr>
+        <w:pStyle w:val="13"/>
+        <w:keepNext w:val="0"/>
+        <w:keepLines w:val="0"/>
+        <w:widowControl/>
+        <w:suppressLineNumbers w:val="0"/>
+        <w:spacing w:before="0" w:beforeAutospacing="1" w:after="0" w:afterAutospacing="1" w:line="360" w:lineRule="auto"/>
+        <w:ind w:left="0" w:right="0"/>
+        <w:jc w:val="both"/>
+      </w:pPr>
+      <w:r>
+        <w:t>Multilingual Support: The interface is equipped to handle inputs in multiple languages, which is crucial for a diverse user base.</w:t>
+      </w:r>
+    </w:p>
+    <w:p>
+      <w:pPr>
+        <w:pStyle w:val="13"/>
+        <w:keepNext w:val="0"/>
+        <w:keepLines w:val="0"/>
+        <w:widowControl/>
+        <w:suppressLineNumbers w:val="0"/>
+        <w:spacing w:before="0" w:beforeAutospacing="1" w:after="0" w:afterAutospacing="1" w:line="360" w:lineRule="auto"/>
+        <w:ind w:left="0" w:right="0"/>
+        <w:jc w:val="both"/>
+        <w:rPr>
+          <w:rFonts w:hint="default" w:cs="Times New Roman"/>
+          <w:b/>
+          <w:bCs/>
+          <w:color w:val="000000" w:themeColor="text1"/>
+          <w:sz w:val="28"/>
+          <w:szCs w:val="28"/>
+          <w:lang w:val="en-IN"/>
+          <w14:textFill>
+            <w14:solidFill>
+              <w14:schemeClr w14:val="tx1"/>
+            </w14:solidFill>
+          </w14:textFill>
+        </w:rPr>
+      </w:pPr>
+      <w:r>
+        <w:t>Data Flow: It sends the "user query" to the Application layer and receives the "deliver answer" back to display or speak to the user</w:t>
+      </w:r>
+      <w:r>
+        <w:rPr>
+          <w:rFonts w:hint="default"/>
+          <w:lang w:val="en-IN"/>
+        </w:rPr>
+        <w:t>.</w:t>
+      </w:r>
+    </w:p>
+    <w:p>
+      <w:pPr>
+        <w:pStyle w:val="13"/>
+        <w:keepNext w:val="0"/>
+        <w:keepLines w:val="0"/>
+        <w:widowControl/>
+        <w:suppressLineNumbers w:val="0"/>
+        <w:spacing w:line="360" w:lineRule="auto"/>
+        <w:jc w:val="both"/>
+        <w:rPr>
+          <w:rFonts w:hint="default" w:cs="Times New Roman"/>
+          <w:b/>
+          <w:bCs/>
+          <w:color w:val="000000" w:themeColor="text1"/>
+          <w:sz w:val="28"/>
+          <w:szCs w:val="28"/>
+          <w:lang w:val="en-IN" w:eastAsia="en-US"/>
+          <w14:textFill>
+            <w14:solidFill>
+              <w14:schemeClr w14:val="tx1"/>
+            </w14:solidFill>
+          </w14:textFill>
+        </w:rPr>
+      </w:pPr>
+      <w:r>
+        <w:rPr>
+          <w:rFonts w:hint="default" w:cs="Times New Roman"/>
+          <w:b/>
+          <w:bCs/>
+          <w:color w:val="000000" w:themeColor="text1"/>
+          <w:sz w:val="28"/>
+          <w:szCs w:val="28"/>
+          <w:lang w:val="en-IN" w:eastAsia="en-US"/>
+          <w14:textFill>
+            <w14:solidFill>
+              <w14:schemeClr w14:val="tx1"/>
+            </w14:solidFill>
+          </w14:textFill>
+        </w:rPr>
+        <w:drawing>
+          <wp:inline distT="0" distB="0" distL="114300" distR="114300">
+            <wp:extent cx="6186805" cy="4079875"/>
+            <wp:effectExtent l="0" t="0" r="0" b="0"/>
+            <wp:docPr id="4" name="Picture 4" descr="Component Architecture"/>
+            <wp:cNvGraphicFramePr>
+              <a:graphicFrameLocks xmlns:a="http://schemas.openxmlformats.org/drawingml/2006/main" noChangeAspect="1"/>
+            </wp:cNvGraphicFramePr>
+            <a:graphic xmlns:a="http://schemas.openxmlformats.org/drawingml/2006/main">
+              <a:graphicData uri="http://schemas.openxmlformats.org/drawingml/2006/picture">
+                <pic:pic xmlns:pic="http://schemas.openxmlformats.org/drawingml/2006/picture">
+                  <pic:nvPicPr>
+                    <pic:cNvPr id="4" name="Picture 4" descr="Component Architecture"/>
+                    <pic:cNvPicPr>
+                      <a:picLocks noChangeAspect="1"/>
+                    </pic:cNvPicPr>
+                  </pic:nvPicPr>
+                  <pic:blipFill>
+                    <a:blip r:embed="rId28"/>
+                    <a:stretch>
+                      <a:fillRect/>
+                    </a:stretch>
+                  </pic:blipFill>
+                  <pic:spPr>
+                    <a:xfrm>
+                      <a:off x="0" y="0"/>
+                      <a:ext cx="6186805" cy="4079875"/>
+                    </a:xfrm>
+                    <a:prstGeom prst="rect">
+                      <a:avLst/>
+                    </a:prstGeom>
+                  </pic:spPr>
+                </pic:pic>
+              </a:graphicData>
+            </a:graphic>
+          </wp:inline>
+        </w:drawing>
+      </w:r>
+    </w:p>
+    <w:p>
+      <w:pPr>
+        <w:pStyle w:val="13"/>
+        <w:keepNext w:val="0"/>
+        <w:keepLines w:val="0"/>
+        <w:widowControl/>
+        <w:suppressLineNumbers w:val="0"/>
+        <w:spacing w:before="0" w:beforeAutospacing="1" w:after="0" w:afterAutospacing="1" w:line="360" w:lineRule="auto"/>
+        <w:ind w:left="0" w:right="0"/>
+        <w:jc w:val="both"/>
+        <w:rPr>
+          <w:rFonts w:hint="default"/>
+          <w:b/>
+          <w:bCs/>
+          <w:lang w:val="en-IN"/>
+        </w:rPr>
+      </w:pPr>
+      <w:r>
+        <w:rPr>
+          <w:b/>
+          <w:bCs/>
+        </w:rPr>
+        <w:t>2. Application Layer (The Core Engine)</w:t>
+      </w:r>
+      <w:r>
+        <w:rPr>
+          <w:rFonts w:hint="default"/>
+          <w:b/>
+          <w:bCs/>
+          <w:lang w:val="en-IN"/>
+        </w:rPr>
+        <w:t>:</w:t>
+      </w:r>
+    </w:p>
+    <w:p>
+      <w:pPr>
+        <w:pStyle w:val="13"/>
+        <w:keepNext w:val="0"/>
+        <w:keepLines w:val="0"/>
+        <w:widowControl/>
+        <w:suppressLineNumbers w:val="0"/>
+        <w:spacing w:before="0" w:beforeAutospacing="1" w:after="0" w:afterAutospacing="1" w:line="360" w:lineRule="auto"/>
+        <w:ind w:left="0" w:right="0"/>
+        <w:jc w:val="both"/>
+      </w:pPr>
+      <w:r>
+        <w:t>This layer acts as the brain of the chatbot, orchestrating the flow of information and processing the natural language.</w:t>
+      </w:r>
+    </w:p>
+    <w:p>
+      <w:pPr>
+        <w:pStyle w:val="13"/>
+        <w:keepNext w:val="0"/>
+        <w:keepLines w:val="0"/>
+        <w:widowControl/>
+        <w:suppressLineNumbers w:val="0"/>
+        <w:spacing w:before="0" w:beforeAutospacing="1" w:after="0" w:afterAutospacing="1" w:line="360" w:lineRule="auto"/>
+        <w:ind w:left="0" w:right="0"/>
+        <w:jc w:val="both"/>
+      </w:pPr>
+      <w:r>
+        <w:t>API Gateway / Backend: Acts as the entry point. It receives the query from the user, routes it to the NLP engine, and eventually sends the final response back to the Presentation layer.</w:t>
+      </w:r>
+    </w:p>
+    <w:p>
+      <w:pPr>
+        <w:pStyle w:val="13"/>
+        <w:keepNext w:val="0"/>
+        <w:keepLines w:val="0"/>
+        <w:widowControl/>
+        <w:suppressLineNumbers w:val="0"/>
+        <w:spacing w:before="0" w:beforeAutospacing="1" w:after="0" w:afterAutospacing="1" w:line="360" w:lineRule="auto"/>
+        <w:ind w:left="0" w:right="0"/>
+        <w:jc w:val="both"/>
+      </w:pPr>
+      <w:r>
+        <w:t>NLP &amp; AI Engine: This is where the heavy lifting happens.</w:t>
+      </w:r>
+    </w:p>
+    <w:p>
+      <w:pPr>
+        <w:pStyle w:val="13"/>
+        <w:keepNext w:val="0"/>
+        <w:keepLines w:val="0"/>
+        <w:widowControl/>
+        <w:suppressLineNumbers w:val="0"/>
+        <w:spacing w:before="0" w:beforeAutospacing="1" w:after="0" w:afterAutospacing="1" w:line="360" w:lineRule="auto"/>
+        <w:ind w:left="0" w:right="0"/>
+        <w:jc w:val="both"/>
+      </w:pPr>
+      <w:r>
+        <w:t>Intent Detection: Determines what the user is trying to achieve (e.g., asking for a specific penal code, seeking bail information).</w:t>
+      </w:r>
+    </w:p>
+    <w:p>
+      <w:pPr>
+        <w:pStyle w:val="13"/>
+        <w:keepNext w:val="0"/>
+        <w:keepLines w:val="0"/>
+        <w:widowControl/>
+        <w:suppressLineNumbers w:val="0"/>
+        <w:spacing w:before="0" w:beforeAutospacing="1" w:after="0" w:afterAutospacing="1" w:line="360" w:lineRule="auto"/>
+        <w:ind w:left="0" w:right="0"/>
+        <w:jc w:val="both"/>
+      </w:pPr>
+      <w:r>
+        <w:t>Entity Recognition: Extracts key nouns and legal terms from the query (e.g., "Section 420", "IPC", "Divorce act").</w:t>
+      </w:r>
+    </w:p>
+    <w:p>
+      <w:pPr>
+        <w:pStyle w:val="13"/>
+        <w:keepNext w:val="0"/>
+        <w:keepLines w:val="0"/>
+        <w:widowControl/>
+        <w:suppressLineNumbers w:val="0"/>
+        <w:spacing w:before="0" w:beforeAutospacing="1" w:after="0" w:afterAutospacing="1" w:line="360" w:lineRule="auto"/>
+        <w:ind w:left="0" w:right="0"/>
+        <w:jc w:val="both"/>
+      </w:pPr>
+      <w:r>
+        <w:t>Query Classification: Routes the processed query to the correct data source based on its nature.</w:t>
+      </w:r>
+    </w:p>
+    <w:p>
+      <w:pPr>
+        <w:pStyle w:val="13"/>
+        <w:keepNext w:val="0"/>
+        <w:keepLines w:val="0"/>
+        <w:widowControl/>
+        <w:suppressLineNumbers w:val="0"/>
+        <w:spacing w:before="0" w:beforeAutospacing="1" w:after="0" w:afterAutospacing="1" w:line="360" w:lineRule="auto"/>
+        <w:ind w:left="0" w:right="0"/>
+        <w:jc w:val="both"/>
+      </w:pPr>
+      <w:r>
+        <w:t>Response Generator: Takes the raw data retrieved from the Data Layer and the processed context from the NLP engine to construct a coherent, human-readable final response.</w:t>
+      </w:r>
+    </w:p>
+    <w:p>
+      <w:pPr>
+        <w:pStyle w:val="13"/>
+        <w:keepNext w:val="0"/>
+        <w:keepLines w:val="0"/>
+        <w:widowControl/>
+        <w:suppressLineNumbers w:val="0"/>
+        <w:spacing w:before="0" w:beforeAutospacing="1" w:after="0" w:afterAutospacing="1" w:line="360" w:lineRule="auto"/>
+        <w:ind w:left="0" w:right="0"/>
+        <w:jc w:val="both"/>
+        <w:rPr>
+          <w:rFonts w:hint="default"/>
+          <w:b/>
+          <w:bCs/>
+          <w:lang w:val="en-IN"/>
+        </w:rPr>
+      </w:pPr>
+      <w:r>
+        <w:rPr>
+          <w:b/>
+          <w:bCs/>
+        </w:rPr>
+        <w:t>3. Data Layer (Information Retrieval)</w:t>
+      </w:r>
+      <w:r>
+        <w:rPr>
+          <w:rFonts w:hint="default"/>
+          <w:b/>
+          <w:bCs/>
+          <w:lang w:val="en-IN"/>
+        </w:rPr>
+        <w:t>:</w:t>
+      </w:r>
+    </w:p>
+    <w:p>
+      <w:pPr>
+        <w:pStyle w:val="13"/>
+        <w:keepNext w:val="0"/>
+        <w:keepLines w:val="0"/>
+        <w:widowControl/>
+        <w:suppressLineNumbers w:val="0"/>
+        <w:spacing w:before="0" w:beforeAutospacing="1" w:after="0" w:afterAutospacing="1" w:line="360" w:lineRule="auto"/>
+        <w:ind w:left="0" w:right="0"/>
+        <w:jc w:val="both"/>
+      </w:pPr>
+      <w:r>
+        <w:t>This layer houses the legal knowledge required to answer the queries. The architecture relies on both internal and external sources, utilizing a Retrieval-Augmented Generation (RAG) approach.</w:t>
+      </w:r>
+    </w:p>
+    <w:p>
+      <w:pPr>
+        <w:pStyle w:val="13"/>
+        <w:keepNext w:val="0"/>
+        <w:keepLines w:val="0"/>
+        <w:widowControl/>
+        <w:suppressLineNumbers w:val="0"/>
+        <w:spacing w:before="0" w:beforeAutospacing="1" w:after="0" w:afterAutospacing="1" w:line="360" w:lineRule="auto"/>
+        <w:ind w:left="0" w:right="0"/>
+        <w:jc w:val="both"/>
+      </w:pPr>
+      <w:r>
+        <w:t>Knowledge Base / Database: An internal repository used to fetch pre-compiled laws, frequently asked questions (FAQs), and user history.</w:t>
+      </w:r>
+    </w:p>
+    <w:p>
+      <w:pPr>
+        <w:pStyle w:val="13"/>
+        <w:keepNext w:val="0"/>
+        <w:keepLines w:val="0"/>
+        <w:widowControl/>
+        <w:suppressLineNumbers w:val="0"/>
+        <w:spacing w:before="0" w:beforeAutospacing="1" w:after="0" w:afterAutospacing="1" w:line="360" w:lineRule="auto"/>
+        <w:ind w:left="0" w:right="0"/>
+        <w:jc w:val="both"/>
+      </w:pPr>
+      <w:r>
+        <w:t>External Legal APIs: Live connections to authoritative Indian legal databases to fetch real-time or highly specific legal data:</w:t>
+      </w:r>
+    </w:p>
+    <w:p>
+      <w:pPr>
+        <w:pStyle w:val="13"/>
+        <w:keepNext w:val="0"/>
+        <w:keepLines w:val="0"/>
+        <w:widowControl/>
+        <w:suppressLineNumbers w:val="0"/>
+        <w:spacing w:before="0" w:beforeAutospacing="1" w:after="0" w:afterAutospacing="1" w:line="360" w:lineRule="auto"/>
+        <w:ind w:left="0" w:right="0"/>
+        <w:jc w:val="both"/>
+      </w:pPr>
+      <w:r>
+        <w:t>IndiaCode: For official statutes and acts.</w:t>
+      </w:r>
+    </w:p>
+    <w:p>
+      <w:pPr>
+        <w:pStyle w:val="13"/>
+        <w:keepNext w:val="0"/>
+        <w:keepLines w:val="0"/>
+        <w:widowControl/>
+        <w:suppressLineNumbers w:val="0"/>
+        <w:spacing w:before="0" w:beforeAutospacing="1" w:after="0" w:afterAutospacing="1" w:line="360" w:lineRule="auto"/>
+        <w:ind w:left="0" w:right="0"/>
+        <w:jc w:val="both"/>
+      </w:pPr>
+      <w:r>
+        <w:t>LawRato: Likely used for lawyer directories or practical legal advice formats.</w:t>
+      </w:r>
+    </w:p>
+    <w:p>
+      <w:pPr>
+        <w:pStyle w:val="13"/>
+        <w:keepNext w:val="0"/>
+        <w:keepLines w:val="0"/>
+        <w:widowControl/>
+        <w:suppressLineNumbers w:val="0"/>
+        <w:spacing w:before="0" w:beforeAutospacing="1" w:after="0" w:afterAutospacing="1" w:line="360" w:lineRule="auto"/>
+        <w:ind w:left="0" w:right="0"/>
+        <w:jc w:val="both"/>
+      </w:pPr>
+      <w:r>
+        <w:t>eCourts: For fetching case statuses, judgments, or court-specific data.</w:t>
+      </w:r>
+    </w:p>
+    <w:p>
+      <w:pPr>
+        <w:pStyle w:val="13"/>
+        <w:keepNext w:val="0"/>
+        <w:keepLines w:val="0"/>
+        <w:widowControl/>
+        <w:suppressLineNumbers w:val="0"/>
+        <w:spacing w:before="0" w:beforeAutospacing="1" w:after="0" w:afterAutospacing="1" w:line="360" w:lineRule="auto"/>
+        <w:ind w:left="0" w:right="0"/>
+        <w:jc w:val="both"/>
+        <w:rPr>
+          <w:rFonts w:hint="default"/>
+          <w:b/>
+          <w:bCs/>
+          <w:lang w:val="en-IN"/>
+        </w:rPr>
+      </w:pPr>
+      <w:r>
+        <w:rPr>
+          <w:b/>
+          <w:bCs/>
+        </w:rPr>
+        <w:t>4. Support Layer (Utility &amp; Analytics)</w:t>
+      </w:r>
+      <w:r>
+        <w:rPr>
+          <w:rFonts w:hint="default"/>
+          <w:b/>
+          <w:bCs/>
+          <w:lang w:val="en-IN"/>
+        </w:rPr>
+        <w:t>:</w:t>
+      </w:r>
+    </w:p>
+    <w:p>
+      <w:pPr>
+        <w:pStyle w:val="13"/>
+        <w:keepNext w:val="0"/>
+        <w:keepLines w:val="0"/>
+        <w:widowControl/>
+        <w:suppressLineNumbers w:val="0"/>
+        <w:spacing w:before="0" w:beforeAutospacing="1" w:after="0" w:afterAutospacing="1" w:line="360" w:lineRule="auto"/>
+        <w:ind w:left="0" w:right="0"/>
+        <w:jc w:val="both"/>
+      </w:pPr>
+      <w:r>
+        <w:t>This layer operates in the background to maintain system health and improve user experience.</w:t>
+      </w:r>
+    </w:p>
+    <w:p>
+      <w:pPr>
+        <w:pStyle w:val="13"/>
+        <w:keepNext w:val="0"/>
+        <w:keepLines w:val="0"/>
+        <w:widowControl/>
+        <w:suppressLineNumbers w:val="0"/>
+        <w:spacing w:before="0" w:beforeAutospacing="1" w:after="0" w:afterAutospacing="1" w:line="360" w:lineRule="auto"/>
+        <w:ind w:left="0" w:right="0"/>
+        <w:jc w:val="both"/>
+      </w:pPr>
+      <w:r>
+        <w:t>Logging &amp; Analytics: Captures anonymized user interaction data from the API Gateway and response data from the Response Generator. This is essential for monitoring system performance and improving the AI models over time.</w:t>
+      </w:r>
+    </w:p>
+    <w:p>
+      <w:pPr>
+        <w:pStyle w:val="13"/>
+        <w:keepNext w:val="0"/>
+        <w:keepLines w:val="0"/>
+        <w:widowControl/>
+        <w:suppressLineNumbers w:val="0"/>
+        <w:spacing w:before="0" w:beforeAutospacing="1" w:after="0" w:afterAutospacing="1" w:line="360" w:lineRule="auto"/>
+        <w:ind w:left="0" w:right="0"/>
+        <w:jc w:val="both"/>
+      </w:pPr>
+      <w:r>
+        <w:t>Translation &amp; TTS (Text-to-Speech): Takes the generated response and converts it into the user's preferred language or synthesizes it into audio for voice output, feeding it back to the Response Generator.</w:t>
+      </w:r>
+    </w:p>
+    <w:p>
+      <w:pPr>
+        <w:pStyle w:val="13"/>
+        <w:keepNext w:val="0"/>
+        <w:keepLines w:val="0"/>
+        <w:widowControl/>
+        <w:suppressLineNumbers w:val="0"/>
+        <w:spacing w:line="360" w:lineRule="auto"/>
+        <w:jc w:val="both"/>
+        <w:rPr>
+          <w:rFonts w:hint="default" w:cs="Times New Roman"/>
+          <w:b/>
+          <w:bCs/>
+          <w:color w:val="000000" w:themeColor="text1"/>
+          <w:sz w:val="28"/>
+          <w:szCs w:val="28"/>
+          <w:lang w:val="en-IN" w:eastAsia="en-US"/>
+          <w14:textFill>
+            <w14:solidFill>
+              <w14:schemeClr w14:val="tx1"/>
+            </w14:solidFill>
+          </w14:textFill>
+        </w:rPr>
+      </w:pPr>
     </w:p>
     <w:p>
       <w:pPr>
@@ -28150,49 +28912,7 @@
       <w:pPr>
         <w:widowControl/>
         <w:spacing w:after="160" w:line="259" w:lineRule="auto"/>
-        <w:jc w:val="center"/>
-        <w:rPr>
-          <w:rFonts w:hint="default" w:ascii="Times New Roman" w:hAnsi="Times New Roman" w:eastAsia="SimSun" w:cs="Times New Roman"/>
-          <w:b/>
-          <w:bCs w:val="0"/>
-          <w:sz w:val="32"/>
-          <w:szCs w:val="32"/>
-        </w:rPr>
-      </w:pPr>
-    </w:p>
-    <w:p>
-      <w:pPr>
-        <w:widowControl/>
-        <w:spacing w:after="160" w:line="259" w:lineRule="auto"/>
-        <w:jc w:val="center"/>
-        <w:rPr>
-          <w:rFonts w:hint="default" w:ascii="Times New Roman" w:hAnsi="Times New Roman" w:eastAsia="SimSun" w:cs="Times New Roman"/>
-          <w:b/>
-          <w:bCs w:val="0"/>
-          <w:sz w:val="32"/>
-          <w:szCs w:val="32"/>
-        </w:rPr>
-      </w:pPr>
-    </w:p>
-    <w:p>
-      <w:pPr>
-        <w:widowControl/>
-        <w:spacing w:after="160" w:line="259" w:lineRule="auto"/>
-        <w:jc w:val="center"/>
-        <w:rPr>
-          <w:rFonts w:hint="default" w:ascii="Times New Roman" w:hAnsi="Times New Roman" w:eastAsia="SimSun" w:cs="Times New Roman"/>
-          <w:b/>
-          <w:bCs w:val="0"/>
-          <w:sz w:val="32"/>
-          <w:szCs w:val="32"/>
-        </w:rPr>
-      </w:pPr>
-    </w:p>
-    <w:p>
-      <w:pPr>
-        <w:widowControl/>
-        <w:spacing w:after="160" w:line="259" w:lineRule="auto"/>
-        <w:jc w:val="center"/>
+        <w:jc w:val="both"/>
         <w:rPr>
           <w:rFonts w:hint="default" w:ascii="Times New Roman" w:hAnsi="Times New Roman" w:eastAsia="SimSun" w:cs="Times New Roman"/>
           <w:b/>
@@ -30898,7 +31618,7 @@
               </w:tabs>
               <w:spacing w:before="0" w:beforeAutospacing="0" w:after="160" w:afterAutospacing="0" w:line="360" w:lineRule="auto"/>
               <w:ind w:left="0" w:right="0"/>
-              <w:jc w:val="left"/>
+              <w:jc w:val="center"/>
               <w:rPr>
                 <w:rFonts w:hint="default" w:ascii="Times New Roman" w:hAnsi="Times New Roman" w:cs="Times New Roman"/>
                 <w:b w:val="0"/>
@@ -31149,7 +31869,7 @@
               </w:tabs>
               <w:spacing w:before="0" w:beforeAutospacing="0" w:after="160" w:afterAutospacing="0" w:line="360" w:lineRule="auto"/>
               <w:ind w:left="0" w:right="0"/>
-              <w:jc w:val="left"/>
+              <w:jc w:val="center"/>
               <w:rPr>
                 <w:rFonts w:hint="default" w:ascii="Times New Roman" w:hAnsi="Times New Roman" w:cs="Times New Roman"/>
                 <w:b w:val="0"/>
@@ -31419,7 +32139,7 @@
               </w:tabs>
               <w:spacing w:before="0" w:beforeAutospacing="0" w:after="160" w:afterAutospacing="0" w:line="360" w:lineRule="auto"/>
               <w:ind w:left="0" w:right="0"/>
-              <w:jc w:val="left"/>
+              <w:jc w:val="center"/>
               <w:rPr>
                 <w:rFonts w:hint="default" w:ascii="Times New Roman" w:hAnsi="Times New Roman" w:cs="Times New Roman"/>
                 <w:b w:val="0"/>
@@ -31668,7 +32388,7 @@
               </w:tabs>
               <w:spacing w:before="0" w:beforeAutospacing="0" w:after="160" w:afterAutospacing="0" w:line="360" w:lineRule="auto"/>
               <w:ind w:left="0" w:right="0"/>
-              <w:jc w:val="left"/>
+              <w:jc w:val="center"/>
               <w:rPr>
                 <w:rFonts w:hint="default" w:ascii="Times New Roman" w:hAnsi="Times New Roman" w:cs="Times New Roman"/>
                 <w:b w:val="0"/>
@@ -31917,7 +32637,7 @@
               </w:tabs>
               <w:spacing w:before="0" w:beforeAutospacing="0" w:after="160" w:afterAutospacing="0" w:line="360" w:lineRule="auto"/>
               <w:ind w:left="0" w:right="0"/>
-              <w:jc w:val="left"/>
+              <w:jc w:val="center"/>
               <w:rPr>
                 <w:rFonts w:hint="default" w:ascii="Times New Roman" w:hAnsi="Times New Roman" w:cs="Times New Roman"/>
                 <w:b w:val="0"/>
@@ -32163,7 +32883,7 @@
               </w:tabs>
               <w:spacing w:before="0" w:beforeAutospacing="0" w:after="160" w:afterAutospacing="0" w:line="360" w:lineRule="auto"/>
               <w:ind w:left="0" w:right="0"/>
-              <w:jc w:val="left"/>
+              <w:jc w:val="center"/>
               <w:rPr>
                 <w:rFonts w:hint="default" w:ascii="Times New Roman" w:hAnsi="Times New Roman" w:cs="Times New Roman"/>
                 <w:b w:val="0"/>
@@ -32409,7 +33129,7 @@
               </w:tabs>
               <w:spacing w:before="0" w:beforeAutospacing="0" w:after="160" w:afterAutospacing="0" w:line="360" w:lineRule="auto"/>
               <w:ind w:left="0" w:right="0"/>
-              <w:jc w:val="left"/>
+              <w:jc w:val="center"/>
               <w:rPr>
                 <w:rFonts w:hint="default" w:ascii="Times New Roman" w:hAnsi="Times New Roman" w:cs="Times New Roman"/>
                 <w:b w:val="0"/>
@@ -32655,7 +33375,7 @@
               </w:tabs>
               <w:spacing w:before="0" w:beforeAutospacing="0" w:after="160" w:afterAutospacing="0" w:line="360" w:lineRule="auto"/>
               <w:ind w:left="0" w:right="0"/>
-              <w:jc w:val="left"/>
+              <w:jc w:val="center"/>
               <w:rPr>
                 <w:rFonts w:hint="default" w:ascii="Times New Roman" w:hAnsi="Times New Roman" w:cs="Times New Roman"/>
                 <w:b w:val="0"/>
@@ -34410,12 +35130,2383 @@
           <w:tab w:val="center" w:pos="5059"/>
         </w:tabs>
         <w:spacing w:after="160" w:line="360" w:lineRule="auto"/>
-        <w:jc w:val="center"/>
+        <w:jc w:val="both"/>
         <w:rPr>
           <w:rFonts w:hint="default"/>
           <w:b/>
-          <w:sz w:val="32"/>
-          <w:szCs w:val="32"/>
+          <w:sz w:val="28"/>
+          <w:szCs w:val="28"/>
+          <w:lang w:val="en-IN"/>
+        </w:rPr>
+      </w:pPr>
+      <w:r>
+        <w:rPr>
+          <w:rFonts w:hint="default"/>
+          <w:b/>
+          <w:sz w:val="28"/>
+          <w:szCs w:val="28"/>
+          <w:lang w:val="en-IN"/>
+        </w:rPr>
+        <w:t>3.PDF Document Analyzer Testing:</w:t>
+      </w:r>
+    </w:p>
+    <w:tbl>
+      <w:tblPr>
+        <w:tblStyle w:val="15"/>
+        <w:tblW w:w="0" w:type="auto"/>
+        <w:tblInd w:w="0" w:type="dxa"/>
+        <w:tblBorders>
+          <w:top w:val="single" w:color="auto" w:sz="4" w:space="0"/>
+          <w:left w:val="single" w:color="auto" w:sz="4" w:space="0"/>
+          <w:bottom w:val="single" w:color="auto" w:sz="4" w:space="0"/>
+          <w:right w:val="single" w:color="auto" w:sz="4" w:space="0"/>
+          <w:insideH w:val="single" w:color="auto" w:sz="4" w:space="0"/>
+          <w:insideV w:val="single" w:color="auto" w:sz="4" w:space="0"/>
+        </w:tblBorders>
+        <w:tblLayout w:type="autofit"/>
+        <w:tblCellMar>
+          <w:left w:w="108" w:type="dxa"/>
+          <w:right w:w="108" w:type="dxa"/>
+        </w:tblCellMar>
+      </w:tblPr>
+      <w:tblGrid>
+        <w:gridCol w:w="1008"/>
+        <w:gridCol w:w="6628"/>
+        <w:gridCol w:w="2329"/>
+      </w:tblGrid>
+      <w:tr>
+        <w:tblPrEx>
+          <w:tblBorders>
+            <w:top w:val="single" w:color="auto" w:sz="4" w:space="0"/>
+            <w:left w:val="single" w:color="auto" w:sz="4" w:space="0"/>
+            <w:bottom w:val="single" w:color="auto" w:sz="4" w:space="0"/>
+            <w:right w:val="single" w:color="auto" w:sz="4" w:space="0"/>
+            <w:insideH w:val="single" w:color="auto" w:sz="4" w:space="0"/>
+            <w:insideV w:val="single" w:color="auto" w:sz="4" w:space="0"/>
+          </w:tblBorders>
+        </w:tblPrEx>
+        <w:tc>
+          <w:tcPr>
+            <w:tcW w:w="1008" w:type="dxa"/>
+          </w:tcPr>
+          <w:p>
+            <w:pPr>
+              <w:widowControl/>
+              <w:tabs>
+                <w:tab w:val="left" w:pos="2832"/>
+                <w:tab w:val="center" w:pos="5059"/>
+              </w:tabs>
+              <w:spacing w:after="160" w:line="360" w:lineRule="auto"/>
+              <w:jc w:val="both"/>
+              <w:rPr>
+                <w:rFonts w:hint="default"/>
+                <w:b/>
+                <w:sz w:val="28"/>
+                <w:szCs w:val="28"/>
+                <w:vertAlign w:val="baseline"/>
+                <w:lang w:val="en-IN"/>
+              </w:rPr>
+            </w:pPr>
+            <w:r>
+              <w:rPr>
+                <w:rFonts w:hint="default"/>
+                <w:b/>
+                <w:sz w:val="28"/>
+                <w:szCs w:val="28"/>
+                <w:vertAlign w:val="baseline"/>
+                <w:lang w:val="en-IN"/>
+              </w:rPr>
+              <w:t>Sr.No</w:t>
+            </w:r>
+          </w:p>
+        </w:tc>
+        <w:tc>
+          <w:tcPr>
+            <w:tcW w:w="6628" w:type="dxa"/>
+          </w:tcPr>
+          <w:p>
+            <w:pPr>
+              <w:widowControl/>
+              <w:tabs>
+                <w:tab w:val="left" w:pos="2832"/>
+                <w:tab w:val="center" w:pos="5059"/>
+              </w:tabs>
+              <w:spacing w:after="160" w:line="360" w:lineRule="auto"/>
+              <w:jc w:val="both"/>
+              <w:rPr>
+                <w:rFonts w:hint="default"/>
+                <w:b/>
+                <w:sz w:val="28"/>
+                <w:szCs w:val="28"/>
+                <w:vertAlign w:val="baseline"/>
+                <w:lang w:val="en-IN"/>
+              </w:rPr>
+            </w:pPr>
+            <w:r>
+              <w:rPr>
+                <w:rFonts w:hint="default"/>
+                <w:b/>
+                <w:sz w:val="28"/>
+                <w:szCs w:val="28"/>
+                <w:vertAlign w:val="baseline"/>
+                <w:lang w:val="en-IN"/>
+              </w:rPr>
+              <w:t>Test Case</w:t>
+            </w:r>
+          </w:p>
+        </w:tc>
+        <w:tc>
+          <w:tcPr>
+            <w:tcW w:w="2329" w:type="dxa"/>
+          </w:tcPr>
+          <w:p>
+            <w:pPr>
+              <w:widowControl/>
+              <w:tabs>
+                <w:tab w:val="left" w:pos="2832"/>
+                <w:tab w:val="center" w:pos="5059"/>
+              </w:tabs>
+              <w:spacing w:after="160" w:line="360" w:lineRule="auto"/>
+              <w:jc w:val="center"/>
+              <w:rPr>
+                <w:rFonts w:hint="default"/>
+                <w:b/>
+                <w:sz w:val="28"/>
+                <w:szCs w:val="28"/>
+                <w:vertAlign w:val="baseline"/>
+                <w:lang w:val="en-IN"/>
+              </w:rPr>
+            </w:pPr>
+            <w:r>
+              <w:rPr>
+                <w:rFonts w:hint="default"/>
+                <w:b/>
+                <w:sz w:val="28"/>
+                <w:szCs w:val="28"/>
+                <w:vertAlign w:val="baseline"/>
+                <w:lang w:val="en-IN"/>
+              </w:rPr>
+              <w:t>Result</w:t>
+            </w:r>
+          </w:p>
+        </w:tc>
+      </w:tr>
+      <w:tr>
+        <w:tblPrEx>
+          <w:tblBorders>
+            <w:top w:val="single" w:color="auto" w:sz="4" w:space="0"/>
+            <w:left w:val="single" w:color="auto" w:sz="4" w:space="0"/>
+            <w:bottom w:val="single" w:color="auto" w:sz="4" w:space="0"/>
+            <w:right w:val="single" w:color="auto" w:sz="4" w:space="0"/>
+            <w:insideH w:val="single" w:color="auto" w:sz="4" w:space="0"/>
+            <w:insideV w:val="single" w:color="auto" w:sz="4" w:space="0"/>
+          </w:tblBorders>
+          <w:tblCellMar>
+            <w:left w:w="108" w:type="dxa"/>
+            <w:right w:w="108" w:type="dxa"/>
+          </w:tblCellMar>
+        </w:tblPrEx>
+        <w:tc>
+          <w:tcPr>
+            <w:tcW w:w="1008" w:type="dxa"/>
+          </w:tcPr>
+          <w:p>
+            <w:pPr>
+              <w:widowControl/>
+              <w:tabs>
+                <w:tab w:val="left" w:pos="2832"/>
+                <w:tab w:val="center" w:pos="5059"/>
+              </w:tabs>
+              <w:spacing w:after="160" w:line="360" w:lineRule="auto"/>
+              <w:jc w:val="center"/>
+              <w:rPr>
+                <w:rFonts w:hint="default" w:ascii="Times New Roman" w:hAnsi="Times New Roman" w:cs="Times New Roman"/>
+                <w:b w:val="0"/>
+                <w:bCs/>
+                <w:color w:val="000000" w:themeColor="text1"/>
+                <w:sz w:val="24"/>
+                <w:szCs w:val="24"/>
+                <w:vertAlign w:val="baseline"/>
+                <w:lang w:val="en-IN"/>
+                <w14:textFill>
+                  <w14:solidFill>
+                    <w14:schemeClr w14:val="tx1"/>
+                  </w14:solidFill>
+                </w14:textFill>
+              </w:rPr>
+            </w:pPr>
+            <w:r>
+              <w:rPr>
+                <w:rFonts w:hint="default" w:ascii="Times New Roman" w:hAnsi="Times New Roman" w:cs="Times New Roman"/>
+                <w:b w:val="0"/>
+                <w:bCs/>
+                <w:color w:val="000000" w:themeColor="text1"/>
+                <w:sz w:val="24"/>
+                <w:szCs w:val="24"/>
+                <w:vertAlign w:val="baseline"/>
+                <w:lang w:val="en-IN"/>
+                <w14:textFill>
+                  <w14:solidFill>
+                    <w14:schemeClr w14:val="tx1"/>
+                  </w14:solidFill>
+                </w14:textFill>
+              </w:rPr>
+              <w:t>1</w:t>
+            </w:r>
+          </w:p>
+        </w:tc>
+        <w:tc>
+          <w:tcPr>
+            <w:tcW w:w="6628" w:type="dxa"/>
+          </w:tcPr>
+          <w:p>
+            <w:pPr>
+              <w:widowControl/>
+              <w:tabs>
+                <w:tab w:val="left" w:pos="2832"/>
+                <w:tab w:val="center" w:pos="5059"/>
+              </w:tabs>
+              <w:spacing w:after="160" w:line="360" w:lineRule="auto"/>
+              <w:jc w:val="both"/>
+              <w:rPr>
+                <w:rFonts w:hint="default" w:ascii="Times New Roman" w:hAnsi="Times New Roman" w:cs="Times New Roman"/>
+                <w:b w:val="0"/>
+                <w:bCs/>
+                <w:color w:val="000000" w:themeColor="text1"/>
+                <w:sz w:val="24"/>
+                <w:szCs w:val="24"/>
+                <w:vertAlign w:val="baseline"/>
+                <w:lang w:val="en-IN"/>
+                <w14:textFill>
+                  <w14:solidFill>
+                    <w14:schemeClr w14:val="tx1"/>
+                  </w14:solidFill>
+                </w14:textFill>
+              </w:rPr>
+            </w:pPr>
+            <w:r>
+              <w:rPr>
+                <w:rFonts w:hint="default" w:ascii="Times New Roman" w:hAnsi="Times New Roman" w:eastAsia="Segoe UI" w:cs="Times New Roman"/>
+                <w:b w:val="0"/>
+                <w:bCs/>
+                <w:i w:val="0"/>
+                <w:iCs w:val="0"/>
+                <w:caps w:val="0"/>
+                <w:color w:val="000000" w:themeColor="text1"/>
+                <w:spacing w:val="0"/>
+                <w:sz w:val="24"/>
+                <w:szCs w:val="24"/>
+                <w14:textFill>
+                  <w14:solidFill>
+                    <w14:schemeClr w14:val="tx1"/>
+                  </w14:solidFill>
+                </w14:textFill>
+              </w:rPr>
+              <w:t>Root endpoint returns service message</w:t>
+            </w:r>
+          </w:p>
+        </w:tc>
+        <w:tc>
+          <w:tcPr>
+            <w:tcW w:w="2329" w:type="dxa"/>
+          </w:tcPr>
+          <w:p>
+            <w:pPr>
+              <w:widowControl/>
+              <w:spacing w:after="160" w:line="360" w:lineRule="auto"/>
+              <w:jc w:val="center"/>
+              <w:rPr>
+                <w:rFonts w:hint="default" w:ascii="Times New Roman" w:hAnsi="Times New Roman" w:cs="Times New Roman"/>
+                <w:b w:val="0"/>
+                <w:bCs/>
+                <w:color w:val="000000" w:themeColor="text1"/>
+                <w:sz w:val="24"/>
+                <w:szCs w:val="24"/>
+                <w:vertAlign w:val="baseline"/>
+                <w:lang w:val="en-IN"/>
+                <w14:textFill>
+                  <w14:solidFill>
+                    <w14:schemeClr w14:val="tx1"/>
+                  </w14:solidFill>
+                </w14:textFill>
+              </w:rPr>
+            </w:pPr>
+            <w:r>
+              <w:rPr>
+                <w:rFonts w:hint="default" w:ascii="Times New Roman" w:hAnsi="Times New Roman" w:eastAsia="SimSun" w:cs="Times New Roman"/>
+                <w:b w:val="0"/>
+                <w:bCs/>
+                <w:color w:val="000000" w:themeColor="text1"/>
+                <w:sz w:val="24"/>
+                <w:szCs w:val="24"/>
+                <w14:textFill>
+                  <w14:solidFill>
+                    <w14:schemeClr w14:val="tx1"/>
+                  </w14:solidFill>
+                </w14:textFill>
+              </w:rPr>
+              <w:t>Passed</w:t>
+            </w:r>
+          </w:p>
+        </w:tc>
+      </w:tr>
+      <w:tr>
+        <w:tblPrEx>
+          <w:tblBorders>
+            <w:top w:val="single" w:color="auto" w:sz="4" w:space="0"/>
+            <w:left w:val="single" w:color="auto" w:sz="4" w:space="0"/>
+            <w:bottom w:val="single" w:color="auto" w:sz="4" w:space="0"/>
+            <w:right w:val="single" w:color="auto" w:sz="4" w:space="0"/>
+            <w:insideH w:val="single" w:color="auto" w:sz="4" w:space="0"/>
+            <w:insideV w:val="single" w:color="auto" w:sz="4" w:space="0"/>
+          </w:tblBorders>
+          <w:tblCellMar>
+            <w:left w:w="108" w:type="dxa"/>
+            <w:right w:w="108" w:type="dxa"/>
+          </w:tblCellMar>
+        </w:tblPrEx>
+        <w:tc>
+          <w:tcPr>
+            <w:tcW w:w="1008" w:type="dxa"/>
+          </w:tcPr>
+          <w:p>
+            <w:pPr>
+              <w:widowControl/>
+              <w:tabs>
+                <w:tab w:val="left" w:pos="2832"/>
+                <w:tab w:val="center" w:pos="5059"/>
+              </w:tabs>
+              <w:spacing w:after="160" w:line="360" w:lineRule="auto"/>
+              <w:jc w:val="center"/>
+              <w:rPr>
+                <w:rFonts w:hint="default" w:ascii="Times New Roman" w:hAnsi="Times New Roman" w:cs="Times New Roman"/>
+                <w:b w:val="0"/>
+                <w:bCs/>
+                <w:color w:val="000000" w:themeColor="text1"/>
+                <w:sz w:val="24"/>
+                <w:szCs w:val="24"/>
+                <w:vertAlign w:val="baseline"/>
+                <w:lang w:val="en-IN"/>
+                <w14:textFill>
+                  <w14:solidFill>
+                    <w14:schemeClr w14:val="tx1"/>
+                  </w14:solidFill>
+                </w14:textFill>
+              </w:rPr>
+            </w:pPr>
+            <w:r>
+              <w:rPr>
+                <w:rFonts w:hint="default" w:ascii="Times New Roman" w:hAnsi="Times New Roman" w:cs="Times New Roman"/>
+                <w:b w:val="0"/>
+                <w:bCs/>
+                <w:color w:val="000000" w:themeColor="text1"/>
+                <w:sz w:val="24"/>
+                <w:szCs w:val="24"/>
+                <w:vertAlign w:val="baseline"/>
+                <w:lang w:val="en-IN"/>
+                <w14:textFill>
+                  <w14:solidFill>
+                    <w14:schemeClr w14:val="tx1"/>
+                  </w14:solidFill>
+                </w14:textFill>
+              </w:rPr>
+              <w:t>2</w:t>
+            </w:r>
+          </w:p>
+        </w:tc>
+        <w:tc>
+          <w:tcPr>
+            <w:tcW w:w="6628" w:type="dxa"/>
+          </w:tcPr>
+          <w:p>
+            <w:pPr>
+              <w:widowControl/>
+              <w:tabs>
+                <w:tab w:val="left" w:pos="2832"/>
+                <w:tab w:val="center" w:pos="5059"/>
+              </w:tabs>
+              <w:spacing w:after="160" w:line="360" w:lineRule="auto"/>
+              <w:jc w:val="both"/>
+              <w:rPr>
+                <w:rFonts w:hint="default" w:ascii="Times New Roman" w:hAnsi="Times New Roman" w:cs="Times New Roman"/>
+                <w:b w:val="0"/>
+                <w:bCs/>
+                <w:color w:val="000000" w:themeColor="text1"/>
+                <w:sz w:val="24"/>
+                <w:szCs w:val="24"/>
+                <w:vertAlign w:val="baseline"/>
+                <w:lang w:val="en-IN"/>
+                <w14:textFill>
+                  <w14:solidFill>
+                    <w14:schemeClr w14:val="tx1"/>
+                  </w14:solidFill>
+                </w14:textFill>
+              </w:rPr>
+            </w:pPr>
+            <w:r>
+              <w:rPr>
+                <w:rFonts w:hint="default" w:ascii="Times New Roman" w:hAnsi="Times New Roman" w:eastAsia="Segoe UI" w:cs="Times New Roman"/>
+                <w:b w:val="0"/>
+                <w:bCs/>
+                <w:i w:val="0"/>
+                <w:iCs w:val="0"/>
+                <w:caps w:val="0"/>
+                <w:color w:val="000000" w:themeColor="text1"/>
+                <w:spacing w:val="0"/>
+                <w:sz w:val="24"/>
+                <w:szCs w:val="24"/>
+                <w14:textFill>
+                  <w14:solidFill>
+                    <w14:schemeClr w14:val="tx1"/>
+                  </w14:solidFill>
+                </w14:textFill>
+              </w:rPr>
+              <w:t>Health endpoint returns healthy statu</w:t>
+            </w:r>
+            <w:r>
+              <w:rPr>
+                <w:rFonts w:hint="default" w:ascii="Times New Roman" w:hAnsi="Times New Roman" w:eastAsia="Segoe UI" w:cs="Times New Roman"/>
+                <w:b w:val="0"/>
+                <w:bCs/>
+                <w:i w:val="0"/>
+                <w:iCs w:val="0"/>
+                <w:caps w:val="0"/>
+                <w:color w:val="000000" w:themeColor="text1"/>
+                <w:spacing w:val="0"/>
+                <w:sz w:val="24"/>
+                <w:szCs w:val="24"/>
+                <w:lang w:val="en-IN"/>
+                <w14:textFill>
+                  <w14:solidFill>
+                    <w14:schemeClr w14:val="tx1"/>
+                  </w14:solidFill>
+                </w14:textFill>
+              </w:rPr>
+              <w:t>s</w:t>
+            </w:r>
+          </w:p>
+        </w:tc>
+        <w:tc>
+          <w:tcPr>
+            <w:tcW w:w="2329" w:type="dxa"/>
+          </w:tcPr>
+          <w:p>
+            <w:pPr>
+              <w:widowControl/>
+              <w:spacing w:after="160" w:line="360" w:lineRule="auto"/>
+              <w:jc w:val="center"/>
+              <w:rPr>
+                <w:rFonts w:hint="default" w:ascii="Times New Roman" w:hAnsi="Times New Roman" w:cs="Times New Roman"/>
+                <w:b w:val="0"/>
+                <w:bCs/>
+                <w:color w:val="000000" w:themeColor="text1"/>
+                <w:sz w:val="24"/>
+                <w:szCs w:val="24"/>
+                <w:vertAlign w:val="baseline"/>
+                <w:lang w:val="en-IN"/>
+                <w14:textFill>
+                  <w14:solidFill>
+                    <w14:schemeClr w14:val="tx1"/>
+                  </w14:solidFill>
+                </w14:textFill>
+              </w:rPr>
+            </w:pPr>
+            <w:r>
+              <w:rPr>
+                <w:rFonts w:hint="default" w:ascii="Times New Roman" w:hAnsi="Times New Roman" w:eastAsia="SimSun" w:cs="Times New Roman"/>
+                <w:b w:val="0"/>
+                <w:bCs/>
+                <w:color w:val="000000" w:themeColor="text1"/>
+                <w:sz w:val="24"/>
+                <w:szCs w:val="24"/>
+                <w14:textFill>
+                  <w14:solidFill>
+                    <w14:schemeClr w14:val="tx1"/>
+                  </w14:solidFill>
+                </w14:textFill>
+              </w:rPr>
+              <w:t>Passed</w:t>
+            </w:r>
+          </w:p>
+        </w:tc>
+      </w:tr>
+      <w:tr>
+        <w:tblPrEx>
+          <w:tblBorders>
+            <w:top w:val="single" w:color="auto" w:sz="4" w:space="0"/>
+            <w:left w:val="single" w:color="auto" w:sz="4" w:space="0"/>
+            <w:bottom w:val="single" w:color="auto" w:sz="4" w:space="0"/>
+            <w:right w:val="single" w:color="auto" w:sz="4" w:space="0"/>
+            <w:insideH w:val="single" w:color="auto" w:sz="4" w:space="0"/>
+            <w:insideV w:val="single" w:color="auto" w:sz="4" w:space="0"/>
+          </w:tblBorders>
+          <w:tblCellMar>
+            <w:left w:w="108" w:type="dxa"/>
+            <w:right w:w="108" w:type="dxa"/>
+          </w:tblCellMar>
+        </w:tblPrEx>
+        <w:tc>
+          <w:tcPr>
+            <w:tcW w:w="1008" w:type="dxa"/>
+          </w:tcPr>
+          <w:p>
+            <w:pPr>
+              <w:widowControl/>
+              <w:tabs>
+                <w:tab w:val="left" w:pos="2832"/>
+                <w:tab w:val="center" w:pos="5059"/>
+              </w:tabs>
+              <w:spacing w:after="160" w:line="360" w:lineRule="auto"/>
+              <w:jc w:val="center"/>
+              <w:rPr>
+                <w:rFonts w:hint="default" w:ascii="Times New Roman" w:hAnsi="Times New Roman" w:cs="Times New Roman"/>
+                <w:b w:val="0"/>
+                <w:bCs/>
+                <w:color w:val="000000" w:themeColor="text1"/>
+                <w:sz w:val="24"/>
+                <w:szCs w:val="24"/>
+                <w:vertAlign w:val="baseline"/>
+                <w:lang w:val="en-IN"/>
+                <w14:textFill>
+                  <w14:solidFill>
+                    <w14:schemeClr w14:val="tx1"/>
+                  </w14:solidFill>
+                </w14:textFill>
+              </w:rPr>
+            </w:pPr>
+            <w:r>
+              <w:rPr>
+                <w:rFonts w:hint="default" w:ascii="Times New Roman" w:hAnsi="Times New Roman" w:cs="Times New Roman"/>
+                <w:b w:val="0"/>
+                <w:bCs/>
+                <w:color w:val="000000" w:themeColor="text1"/>
+                <w:sz w:val="24"/>
+                <w:szCs w:val="24"/>
+                <w:vertAlign w:val="baseline"/>
+                <w:lang w:val="en-IN"/>
+                <w14:textFill>
+                  <w14:solidFill>
+                    <w14:schemeClr w14:val="tx1"/>
+                  </w14:solidFill>
+                </w14:textFill>
+              </w:rPr>
+              <w:t>3</w:t>
+            </w:r>
+          </w:p>
+        </w:tc>
+        <w:tc>
+          <w:tcPr>
+            <w:tcW w:w="6628" w:type="dxa"/>
+          </w:tcPr>
+          <w:p>
+            <w:pPr>
+              <w:widowControl/>
+              <w:tabs>
+                <w:tab w:val="left" w:pos="2832"/>
+                <w:tab w:val="center" w:pos="5059"/>
+              </w:tabs>
+              <w:spacing w:after="160" w:line="360" w:lineRule="auto"/>
+              <w:jc w:val="both"/>
+              <w:rPr>
+                <w:rFonts w:hint="default" w:ascii="Times New Roman" w:hAnsi="Times New Roman" w:eastAsia="Segoe UI" w:cs="Times New Roman"/>
+                <w:b w:val="0"/>
+                <w:bCs/>
+                <w:i w:val="0"/>
+                <w:iCs w:val="0"/>
+                <w:caps w:val="0"/>
+                <w:color w:val="000000" w:themeColor="text1"/>
+                <w:spacing w:val="0"/>
+                <w:sz w:val="24"/>
+                <w:szCs w:val="24"/>
+                <w14:textFill>
+                  <w14:solidFill>
+                    <w14:schemeClr w14:val="tx1"/>
+                  </w14:solidFill>
+                </w14:textFill>
+              </w:rPr>
+            </w:pPr>
+            <w:r>
+              <w:rPr>
+                <w:rFonts w:hint="default" w:ascii="Times New Roman" w:hAnsi="Times New Roman" w:eastAsia="Segoe UI" w:cs="Times New Roman"/>
+                <w:b w:val="0"/>
+                <w:bCs/>
+                <w:i w:val="0"/>
+                <w:iCs w:val="0"/>
+                <w:caps w:val="0"/>
+                <w:color w:val="000000" w:themeColor="text1"/>
+                <w:spacing w:val="0"/>
+                <w:sz w:val="24"/>
+                <w:szCs w:val="24"/>
+                <w14:textFill>
+                  <w14:solidFill>
+                    <w14:schemeClr w14:val="tx1"/>
+                  </w14:solidFill>
+                </w14:textFill>
+              </w:rPr>
+              <w:t>PDF upload rejects non-PDF file</w:t>
+            </w:r>
+          </w:p>
+        </w:tc>
+        <w:tc>
+          <w:tcPr>
+            <w:tcW w:w="2329" w:type="dxa"/>
+          </w:tcPr>
+          <w:p>
+            <w:pPr>
+              <w:widowControl/>
+              <w:spacing w:after="160" w:line="360" w:lineRule="auto"/>
+              <w:jc w:val="center"/>
+              <w:rPr>
+                <w:rFonts w:hint="default" w:ascii="Times New Roman" w:hAnsi="Times New Roman" w:cs="Times New Roman"/>
+                <w:b w:val="0"/>
+                <w:bCs/>
+                <w:color w:val="000000" w:themeColor="text1"/>
+                <w:sz w:val="24"/>
+                <w:szCs w:val="24"/>
+                <w:vertAlign w:val="baseline"/>
+                <w:lang w:val="en-IN"/>
+                <w14:textFill>
+                  <w14:solidFill>
+                    <w14:schemeClr w14:val="tx1"/>
+                  </w14:solidFill>
+                </w14:textFill>
+              </w:rPr>
+            </w:pPr>
+            <w:r>
+              <w:rPr>
+                <w:rFonts w:hint="default" w:ascii="Times New Roman" w:hAnsi="Times New Roman" w:eastAsia="SimSun" w:cs="Times New Roman"/>
+                <w:b w:val="0"/>
+                <w:bCs/>
+                <w:color w:val="000000" w:themeColor="text1"/>
+                <w:sz w:val="24"/>
+                <w:szCs w:val="24"/>
+                <w14:textFill>
+                  <w14:solidFill>
+                    <w14:schemeClr w14:val="tx1"/>
+                  </w14:solidFill>
+                </w14:textFill>
+              </w:rPr>
+              <w:t>Passed</w:t>
+            </w:r>
+          </w:p>
+        </w:tc>
+      </w:tr>
+      <w:tr>
+        <w:tblPrEx>
+          <w:tblBorders>
+            <w:top w:val="single" w:color="auto" w:sz="4" w:space="0"/>
+            <w:left w:val="single" w:color="auto" w:sz="4" w:space="0"/>
+            <w:bottom w:val="single" w:color="auto" w:sz="4" w:space="0"/>
+            <w:right w:val="single" w:color="auto" w:sz="4" w:space="0"/>
+            <w:insideH w:val="single" w:color="auto" w:sz="4" w:space="0"/>
+            <w:insideV w:val="single" w:color="auto" w:sz="4" w:space="0"/>
+          </w:tblBorders>
+          <w:tblCellMar>
+            <w:left w:w="108" w:type="dxa"/>
+            <w:right w:w="108" w:type="dxa"/>
+          </w:tblCellMar>
+        </w:tblPrEx>
+        <w:tc>
+          <w:tcPr>
+            <w:tcW w:w="1008" w:type="dxa"/>
+          </w:tcPr>
+          <w:p>
+            <w:pPr>
+              <w:widowControl/>
+              <w:tabs>
+                <w:tab w:val="left" w:pos="2832"/>
+                <w:tab w:val="center" w:pos="5059"/>
+              </w:tabs>
+              <w:spacing w:after="160" w:line="360" w:lineRule="auto"/>
+              <w:jc w:val="center"/>
+              <w:rPr>
+                <w:rFonts w:hint="default" w:ascii="Times New Roman" w:hAnsi="Times New Roman" w:cs="Times New Roman"/>
+                <w:b w:val="0"/>
+                <w:bCs/>
+                <w:color w:val="000000" w:themeColor="text1"/>
+                <w:sz w:val="24"/>
+                <w:szCs w:val="24"/>
+                <w:vertAlign w:val="baseline"/>
+                <w:lang w:val="en-IN"/>
+                <w14:textFill>
+                  <w14:solidFill>
+                    <w14:schemeClr w14:val="tx1"/>
+                  </w14:solidFill>
+                </w14:textFill>
+              </w:rPr>
+            </w:pPr>
+            <w:r>
+              <w:rPr>
+                <w:rFonts w:hint="default" w:ascii="Times New Roman" w:hAnsi="Times New Roman" w:cs="Times New Roman"/>
+                <w:b w:val="0"/>
+                <w:bCs/>
+                <w:color w:val="000000" w:themeColor="text1"/>
+                <w:sz w:val="24"/>
+                <w:szCs w:val="24"/>
+                <w:vertAlign w:val="baseline"/>
+                <w:lang w:val="en-IN"/>
+                <w14:textFill>
+                  <w14:solidFill>
+                    <w14:schemeClr w14:val="tx1"/>
+                  </w14:solidFill>
+                </w14:textFill>
+              </w:rPr>
+              <w:t>4</w:t>
+            </w:r>
+          </w:p>
+        </w:tc>
+        <w:tc>
+          <w:tcPr>
+            <w:tcW w:w="6628" w:type="dxa"/>
+          </w:tcPr>
+          <w:p>
+            <w:pPr>
+              <w:widowControl/>
+              <w:tabs>
+                <w:tab w:val="left" w:pos="2832"/>
+                <w:tab w:val="center" w:pos="5059"/>
+              </w:tabs>
+              <w:spacing w:after="160" w:line="360" w:lineRule="auto"/>
+              <w:jc w:val="both"/>
+              <w:rPr>
+                <w:rFonts w:hint="default" w:ascii="Times New Roman" w:hAnsi="Times New Roman" w:eastAsia="Segoe UI" w:cs="Times New Roman"/>
+                <w:b w:val="0"/>
+                <w:bCs/>
+                <w:i w:val="0"/>
+                <w:iCs w:val="0"/>
+                <w:caps w:val="0"/>
+                <w:color w:val="000000" w:themeColor="text1"/>
+                <w:spacing w:val="0"/>
+                <w:sz w:val="24"/>
+                <w:szCs w:val="24"/>
+                <w:lang w:val="en-IN"/>
+                <w14:textFill>
+                  <w14:solidFill>
+                    <w14:schemeClr w14:val="tx1"/>
+                  </w14:solidFill>
+                </w14:textFill>
+              </w:rPr>
+            </w:pPr>
+            <w:r>
+              <w:rPr>
+                <w:rFonts w:hint="default" w:ascii="Times New Roman" w:hAnsi="Times New Roman" w:eastAsia="Segoe UI" w:cs="Times New Roman"/>
+                <w:b w:val="0"/>
+                <w:bCs/>
+                <w:i w:val="0"/>
+                <w:iCs w:val="0"/>
+                <w:caps w:val="0"/>
+                <w:color w:val="000000" w:themeColor="text1"/>
+                <w:spacing w:val="0"/>
+                <w:sz w:val="24"/>
+                <w:szCs w:val="24"/>
+                <w14:textFill>
+                  <w14:solidFill>
+                    <w14:schemeClr w14:val="tx1"/>
+                  </w14:solidFill>
+                </w14:textFill>
+              </w:rPr>
+              <w:t>PDF upload extracts text from valid PD</w:t>
+            </w:r>
+            <w:r>
+              <w:rPr>
+                <w:rFonts w:hint="default" w:ascii="Times New Roman" w:hAnsi="Times New Roman" w:eastAsia="Segoe UI" w:cs="Times New Roman"/>
+                <w:b w:val="0"/>
+                <w:bCs/>
+                <w:i w:val="0"/>
+                <w:iCs w:val="0"/>
+                <w:caps w:val="0"/>
+                <w:color w:val="000000" w:themeColor="text1"/>
+                <w:spacing w:val="0"/>
+                <w:sz w:val="24"/>
+                <w:szCs w:val="24"/>
+                <w:lang w:val="en-IN"/>
+                <w14:textFill>
+                  <w14:solidFill>
+                    <w14:schemeClr w14:val="tx1"/>
+                  </w14:solidFill>
+                </w14:textFill>
+              </w:rPr>
+              <w:t>F</w:t>
+            </w:r>
+          </w:p>
+        </w:tc>
+        <w:tc>
+          <w:tcPr>
+            <w:tcW w:w="2329" w:type="dxa"/>
+          </w:tcPr>
+          <w:p>
+            <w:pPr>
+              <w:widowControl/>
+              <w:spacing w:after="160" w:line="360" w:lineRule="auto"/>
+              <w:jc w:val="center"/>
+              <w:rPr>
+                <w:rFonts w:hint="default" w:ascii="Times New Roman" w:hAnsi="Times New Roman" w:cs="Times New Roman"/>
+                <w:b w:val="0"/>
+                <w:bCs/>
+                <w:color w:val="000000" w:themeColor="text1"/>
+                <w:sz w:val="24"/>
+                <w:szCs w:val="24"/>
+                <w:vertAlign w:val="baseline"/>
+                <w:lang w:val="en-IN"/>
+                <w14:textFill>
+                  <w14:solidFill>
+                    <w14:schemeClr w14:val="tx1"/>
+                  </w14:solidFill>
+                </w14:textFill>
+              </w:rPr>
+            </w:pPr>
+            <w:r>
+              <w:rPr>
+                <w:rFonts w:hint="default" w:ascii="Times New Roman" w:hAnsi="Times New Roman" w:eastAsia="SimSun" w:cs="Times New Roman"/>
+                <w:b w:val="0"/>
+                <w:bCs/>
+                <w:color w:val="000000" w:themeColor="text1"/>
+                <w:sz w:val="24"/>
+                <w:szCs w:val="24"/>
+                <w14:textFill>
+                  <w14:solidFill>
+                    <w14:schemeClr w14:val="tx1"/>
+                  </w14:solidFill>
+                </w14:textFill>
+              </w:rPr>
+              <w:t>Passed</w:t>
+            </w:r>
+          </w:p>
+        </w:tc>
+      </w:tr>
+      <w:tr>
+        <w:tblPrEx>
+          <w:tblBorders>
+            <w:top w:val="single" w:color="auto" w:sz="4" w:space="0"/>
+            <w:left w:val="single" w:color="auto" w:sz="4" w:space="0"/>
+            <w:bottom w:val="single" w:color="auto" w:sz="4" w:space="0"/>
+            <w:right w:val="single" w:color="auto" w:sz="4" w:space="0"/>
+            <w:insideH w:val="single" w:color="auto" w:sz="4" w:space="0"/>
+            <w:insideV w:val="single" w:color="auto" w:sz="4" w:space="0"/>
+          </w:tblBorders>
+          <w:tblCellMar>
+            <w:left w:w="108" w:type="dxa"/>
+            <w:right w:w="108" w:type="dxa"/>
+          </w:tblCellMar>
+        </w:tblPrEx>
+        <w:tc>
+          <w:tcPr>
+            <w:tcW w:w="1008" w:type="dxa"/>
+          </w:tcPr>
+          <w:p>
+            <w:pPr>
+              <w:widowControl/>
+              <w:tabs>
+                <w:tab w:val="left" w:pos="2832"/>
+                <w:tab w:val="center" w:pos="5059"/>
+              </w:tabs>
+              <w:spacing w:after="160" w:line="360" w:lineRule="auto"/>
+              <w:jc w:val="center"/>
+              <w:rPr>
+                <w:rFonts w:hint="default" w:ascii="Times New Roman" w:hAnsi="Times New Roman" w:cs="Times New Roman"/>
+                <w:b w:val="0"/>
+                <w:bCs/>
+                <w:color w:val="000000" w:themeColor="text1"/>
+                <w:sz w:val="24"/>
+                <w:szCs w:val="24"/>
+                <w:vertAlign w:val="baseline"/>
+                <w:lang w:val="en-IN"/>
+                <w14:textFill>
+                  <w14:solidFill>
+                    <w14:schemeClr w14:val="tx1"/>
+                  </w14:solidFill>
+                </w14:textFill>
+              </w:rPr>
+            </w:pPr>
+            <w:r>
+              <w:rPr>
+                <w:rFonts w:hint="default" w:ascii="Times New Roman" w:hAnsi="Times New Roman" w:cs="Times New Roman"/>
+                <w:b w:val="0"/>
+                <w:bCs/>
+                <w:color w:val="000000" w:themeColor="text1"/>
+                <w:sz w:val="24"/>
+                <w:szCs w:val="24"/>
+                <w:vertAlign w:val="baseline"/>
+                <w:lang w:val="en-IN"/>
+                <w14:textFill>
+                  <w14:solidFill>
+                    <w14:schemeClr w14:val="tx1"/>
+                  </w14:solidFill>
+                </w14:textFill>
+              </w:rPr>
+              <w:t>5</w:t>
+            </w:r>
+          </w:p>
+        </w:tc>
+        <w:tc>
+          <w:tcPr>
+            <w:tcW w:w="6628" w:type="dxa"/>
+          </w:tcPr>
+          <w:p>
+            <w:pPr>
+              <w:widowControl/>
+              <w:tabs>
+                <w:tab w:val="left" w:pos="2832"/>
+                <w:tab w:val="center" w:pos="5059"/>
+              </w:tabs>
+              <w:spacing w:after="160" w:line="360" w:lineRule="auto"/>
+              <w:jc w:val="both"/>
+              <w:rPr>
+                <w:rFonts w:hint="default" w:ascii="Times New Roman" w:hAnsi="Times New Roman" w:eastAsia="Segoe UI" w:cs="Times New Roman"/>
+                <w:b w:val="0"/>
+                <w:bCs/>
+                <w:i w:val="0"/>
+                <w:iCs w:val="0"/>
+                <w:caps w:val="0"/>
+                <w:color w:val="000000" w:themeColor="text1"/>
+                <w:spacing w:val="0"/>
+                <w:sz w:val="24"/>
+                <w:szCs w:val="24"/>
+                <w:lang w:val="en-IN"/>
+                <w14:textFill>
+                  <w14:solidFill>
+                    <w14:schemeClr w14:val="tx1"/>
+                  </w14:solidFill>
+                </w14:textFill>
+              </w:rPr>
+            </w:pPr>
+            <w:r>
+              <w:rPr>
+                <w:rFonts w:hint="default" w:ascii="Times New Roman" w:hAnsi="Times New Roman" w:eastAsia="Segoe UI" w:cs="Times New Roman"/>
+                <w:b w:val="0"/>
+                <w:bCs/>
+                <w:i w:val="0"/>
+                <w:iCs w:val="0"/>
+                <w:caps w:val="0"/>
+                <w:color w:val="000000" w:themeColor="text1"/>
+                <w:spacing w:val="0"/>
+                <w:sz w:val="24"/>
+                <w:szCs w:val="24"/>
+                <w14:textFill>
+                  <w14:solidFill>
+                    <w14:schemeClr w14:val="tx1"/>
+                  </w14:solidFill>
+                </w14:textFill>
+              </w:rPr>
+              <w:t>Summarize requires PDF conten</w:t>
+            </w:r>
+            <w:r>
+              <w:rPr>
+                <w:rFonts w:hint="default" w:ascii="Times New Roman" w:hAnsi="Times New Roman" w:eastAsia="Segoe UI" w:cs="Times New Roman"/>
+                <w:b w:val="0"/>
+                <w:bCs/>
+                <w:i w:val="0"/>
+                <w:iCs w:val="0"/>
+                <w:caps w:val="0"/>
+                <w:color w:val="000000" w:themeColor="text1"/>
+                <w:spacing w:val="0"/>
+                <w:sz w:val="24"/>
+                <w:szCs w:val="24"/>
+                <w:lang w:val="en-IN"/>
+                <w14:textFill>
+                  <w14:solidFill>
+                    <w14:schemeClr w14:val="tx1"/>
+                  </w14:solidFill>
+                </w14:textFill>
+              </w:rPr>
+              <w:t>t</w:t>
+            </w:r>
+          </w:p>
+        </w:tc>
+        <w:tc>
+          <w:tcPr>
+            <w:tcW w:w="2329" w:type="dxa"/>
+          </w:tcPr>
+          <w:p>
+            <w:pPr>
+              <w:widowControl/>
+              <w:spacing w:after="160" w:line="360" w:lineRule="auto"/>
+              <w:jc w:val="center"/>
+              <w:rPr>
+                <w:rFonts w:hint="default" w:ascii="Times New Roman" w:hAnsi="Times New Roman" w:cs="Times New Roman"/>
+                <w:b w:val="0"/>
+                <w:bCs/>
+                <w:color w:val="000000" w:themeColor="text1"/>
+                <w:sz w:val="24"/>
+                <w:szCs w:val="24"/>
+                <w:vertAlign w:val="baseline"/>
+                <w:lang w:val="en-IN"/>
+                <w14:textFill>
+                  <w14:solidFill>
+                    <w14:schemeClr w14:val="tx1"/>
+                  </w14:solidFill>
+                </w14:textFill>
+              </w:rPr>
+            </w:pPr>
+            <w:r>
+              <w:rPr>
+                <w:rFonts w:hint="default" w:ascii="Times New Roman" w:hAnsi="Times New Roman" w:eastAsia="SimSun" w:cs="Times New Roman"/>
+                <w:b w:val="0"/>
+                <w:bCs/>
+                <w:color w:val="000000" w:themeColor="text1"/>
+                <w:sz w:val="24"/>
+                <w:szCs w:val="24"/>
+                <w14:textFill>
+                  <w14:solidFill>
+                    <w14:schemeClr w14:val="tx1"/>
+                  </w14:solidFill>
+                </w14:textFill>
+              </w:rPr>
+              <w:t>Passed</w:t>
+            </w:r>
+          </w:p>
+        </w:tc>
+      </w:tr>
+      <w:tr>
+        <w:tblPrEx>
+          <w:tblBorders>
+            <w:top w:val="single" w:color="auto" w:sz="4" w:space="0"/>
+            <w:left w:val="single" w:color="auto" w:sz="4" w:space="0"/>
+            <w:bottom w:val="single" w:color="auto" w:sz="4" w:space="0"/>
+            <w:right w:val="single" w:color="auto" w:sz="4" w:space="0"/>
+            <w:insideH w:val="single" w:color="auto" w:sz="4" w:space="0"/>
+            <w:insideV w:val="single" w:color="auto" w:sz="4" w:space="0"/>
+          </w:tblBorders>
+          <w:tblCellMar>
+            <w:left w:w="108" w:type="dxa"/>
+            <w:right w:w="108" w:type="dxa"/>
+          </w:tblCellMar>
+        </w:tblPrEx>
+        <w:tc>
+          <w:tcPr>
+            <w:tcW w:w="1008" w:type="dxa"/>
+          </w:tcPr>
+          <w:p>
+            <w:pPr>
+              <w:widowControl/>
+              <w:tabs>
+                <w:tab w:val="left" w:pos="2832"/>
+                <w:tab w:val="center" w:pos="5059"/>
+              </w:tabs>
+              <w:spacing w:after="160" w:line="360" w:lineRule="auto"/>
+              <w:jc w:val="center"/>
+              <w:rPr>
+                <w:rFonts w:hint="default" w:ascii="Times New Roman" w:hAnsi="Times New Roman" w:cs="Times New Roman"/>
+                <w:b w:val="0"/>
+                <w:bCs/>
+                <w:color w:val="000000" w:themeColor="text1"/>
+                <w:sz w:val="24"/>
+                <w:szCs w:val="24"/>
+                <w:vertAlign w:val="baseline"/>
+                <w:lang w:val="en-IN"/>
+                <w14:textFill>
+                  <w14:solidFill>
+                    <w14:schemeClr w14:val="tx1"/>
+                  </w14:solidFill>
+                </w14:textFill>
+              </w:rPr>
+            </w:pPr>
+            <w:r>
+              <w:rPr>
+                <w:rFonts w:hint="default" w:ascii="Times New Roman" w:hAnsi="Times New Roman" w:cs="Times New Roman"/>
+                <w:b w:val="0"/>
+                <w:bCs/>
+                <w:color w:val="000000" w:themeColor="text1"/>
+                <w:sz w:val="24"/>
+                <w:szCs w:val="24"/>
+                <w:vertAlign w:val="baseline"/>
+                <w:lang w:val="en-IN"/>
+                <w14:textFill>
+                  <w14:solidFill>
+                    <w14:schemeClr w14:val="tx1"/>
+                  </w14:solidFill>
+                </w14:textFill>
+              </w:rPr>
+              <w:t>6</w:t>
+            </w:r>
+          </w:p>
+        </w:tc>
+        <w:tc>
+          <w:tcPr>
+            <w:tcW w:w="6628" w:type="dxa"/>
+          </w:tcPr>
+          <w:p>
+            <w:pPr>
+              <w:widowControl/>
+              <w:tabs>
+                <w:tab w:val="left" w:pos="2832"/>
+                <w:tab w:val="center" w:pos="5059"/>
+              </w:tabs>
+              <w:spacing w:after="160" w:line="360" w:lineRule="auto"/>
+              <w:jc w:val="both"/>
+              <w:rPr>
+                <w:rFonts w:hint="default" w:ascii="Times New Roman" w:hAnsi="Times New Roman" w:eastAsia="Segoe UI" w:cs="Times New Roman"/>
+                <w:b w:val="0"/>
+                <w:bCs/>
+                <w:i w:val="0"/>
+                <w:iCs w:val="0"/>
+                <w:caps w:val="0"/>
+                <w:color w:val="000000" w:themeColor="text1"/>
+                <w:spacing w:val="0"/>
+                <w:sz w:val="24"/>
+                <w:szCs w:val="24"/>
+                <w:lang w:val="en-IN"/>
+                <w14:textFill>
+                  <w14:solidFill>
+                    <w14:schemeClr w14:val="tx1"/>
+                  </w14:solidFill>
+                </w14:textFill>
+              </w:rPr>
+            </w:pPr>
+            <w:r>
+              <w:rPr>
+                <w:rFonts w:hint="default" w:ascii="Times New Roman" w:hAnsi="Times New Roman" w:eastAsia="Segoe UI" w:cs="Times New Roman"/>
+                <w:b w:val="0"/>
+                <w:bCs/>
+                <w:i w:val="0"/>
+                <w:iCs w:val="0"/>
+                <w:caps w:val="0"/>
+                <w:color w:val="000000" w:themeColor="text1"/>
+                <w:spacing w:val="0"/>
+                <w:sz w:val="24"/>
+                <w:szCs w:val="24"/>
+                <w14:textFill>
+                  <w14:solidFill>
+                    <w14:schemeClr w14:val="tx1"/>
+                  </w14:solidFill>
+                </w14:textFill>
+              </w:rPr>
+              <w:t>Summarize returns summary and analysis with mocked mode</w:t>
+            </w:r>
+            <w:r>
+              <w:rPr>
+                <w:rFonts w:hint="default" w:ascii="Times New Roman" w:hAnsi="Times New Roman" w:eastAsia="Segoe UI" w:cs="Times New Roman"/>
+                <w:b w:val="0"/>
+                <w:bCs/>
+                <w:i w:val="0"/>
+                <w:iCs w:val="0"/>
+                <w:caps w:val="0"/>
+                <w:color w:val="000000" w:themeColor="text1"/>
+                <w:spacing w:val="0"/>
+                <w:sz w:val="24"/>
+                <w:szCs w:val="24"/>
+                <w:lang w:val="en-IN"/>
+                <w14:textFill>
+                  <w14:solidFill>
+                    <w14:schemeClr w14:val="tx1"/>
+                  </w14:solidFill>
+                </w14:textFill>
+              </w:rPr>
+              <w:t>l</w:t>
+            </w:r>
+          </w:p>
+        </w:tc>
+        <w:tc>
+          <w:tcPr>
+            <w:tcW w:w="2329" w:type="dxa"/>
+          </w:tcPr>
+          <w:p>
+            <w:pPr>
+              <w:widowControl/>
+              <w:spacing w:after="160" w:line="360" w:lineRule="auto"/>
+              <w:jc w:val="center"/>
+              <w:rPr>
+                <w:rFonts w:hint="default" w:ascii="Times New Roman" w:hAnsi="Times New Roman" w:cs="Times New Roman"/>
+                <w:b w:val="0"/>
+                <w:bCs/>
+                <w:color w:val="000000" w:themeColor="text1"/>
+                <w:sz w:val="24"/>
+                <w:szCs w:val="24"/>
+                <w:vertAlign w:val="baseline"/>
+                <w:lang w:val="en-IN"/>
+                <w14:textFill>
+                  <w14:solidFill>
+                    <w14:schemeClr w14:val="tx1"/>
+                  </w14:solidFill>
+                </w14:textFill>
+              </w:rPr>
+            </w:pPr>
+            <w:r>
+              <w:rPr>
+                <w:rFonts w:hint="default" w:ascii="Times New Roman" w:hAnsi="Times New Roman" w:eastAsia="SimSun" w:cs="Times New Roman"/>
+                <w:b w:val="0"/>
+                <w:bCs/>
+                <w:color w:val="000000" w:themeColor="text1"/>
+                <w:sz w:val="24"/>
+                <w:szCs w:val="24"/>
+                <w14:textFill>
+                  <w14:solidFill>
+                    <w14:schemeClr w14:val="tx1"/>
+                  </w14:solidFill>
+                </w14:textFill>
+              </w:rPr>
+              <w:t>Passed</w:t>
+            </w:r>
+          </w:p>
+        </w:tc>
+      </w:tr>
+      <w:tr>
+        <w:tblPrEx>
+          <w:tblBorders>
+            <w:top w:val="single" w:color="auto" w:sz="4" w:space="0"/>
+            <w:left w:val="single" w:color="auto" w:sz="4" w:space="0"/>
+            <w:bottom w:val="single" w:color="auto" w:sz="4" w:space="0"/>
+            <w:right w:val="single" w:color="auto" w:sz="4" w:space="0"/>
+            <w:insideH w:val="single" w:color="auto" w:sz="4" w:space="0"/>
+            <w:insideV w:val="single" w:color="auto" w:sz="4" w:space="0"/>
+          </w:tblBorders>
+          <w:tblCellMar>
+            <w:left w:w="108" w:type="dxa"/>
+            <w:right w:w="108" w:type="dxa"/>
+          </w:tblCellMar>
+        </w:tblPrEx>
+        <w:tc>
+          <w:tcPr>
+            <w:tcW w:w="1008" w:type="dxa"/>
+          </w:tcPr>
+          <w:p>
+            <w:pPr>
+              <w:widowControl/>
+              <w:tabs>
+                <w:tab w:val="left" w:pos="2832"/>
+                <w:tab w:val="center" w:pos="5059"/>
+              </w:tabs>
+              <w:spacing w:after="160" w:line="360" w:lineRule="auto"/>
+              <w:jc w:val="center"/>
+              <w:rPr>
+                <w:rFonts w:hint="default" w:ascii="Times New Roman" w:hAnsi="Times New Roman" w:cs="Times New Roman"/>
+                <w:b w:val="0"/>
+                <w:bCs/>
+                <w:color w:val="000000" w:themeColor="text1"/>
+                <w:sz w:val="24"/>
+                <w:szCs w:val="24"/>
+                <w:vertAlign w:val="baseline"/>
+                <w:lang w:val="en-IN"/>
+                <w14:textFill>
+                  <w14:solidFill>
+                    <w14:schemeClr w14:val="tx1"/>
+                  </w14:solidFill>
+                </w14:textFill>
+              </w:rPr>
+            </w:pPr>
+            <w:r>
+              <w:rPr>
+                <w:rFonts w:hint="default" w:ascii="Times New Roman" w:hAnsi="Times New Roman" w:cs="Times New Roman"/>
+                <w:b w:val="0"/>
+                <w:bCs/>
+                <w:color w:val="000000" w:themeColor="text1"/>
+                <w:sz w:val="24"/>
+                <w:szCs w:val="24"/>
+                <w:vertAlign w:val="baseline"/>
+                <w:lang w:val="en-IN"/>
+                <w14:textFill>
+                  <w14:solidFill>
+                    <w14:schemeClr w14:val="tx1"/>
+                  </w14:solidFill>
+                </w14:textFill>
+              </w:rPr>
+              <w:t>7</w:t>
+            </w:r>
+          </w:p>
+        </w:tc>
+        <w:tc>
+          <w:tcPr>
+            <w:tcW w:w="6628" w:type="dxa"/>
+          </w:tcPr>
+          <w:p>
+            <w:pPr>
+              <w:widowControl/>
+              <w:tabs>
+                <w:tab w:val="left" w:pos="2832"/>
+                <w:tab w:val="center" w:pos="5059"/>
+              </w:tabs>
+              <w:spacing w:after="160" w:line="360" w:lineRule="auto"/>
+              <w:jc w:val="both"/>
+              <w:rPr>
+                <w:rFonts w:hint="default" w:ascii="Times New Roman" w:hAnsi="Times New Roman" w:eastAsia="Segoe UI" w:cs="Times New Roman"/>
+                <w:b w:val="0"/>
+                <w:bCs/>
+                <w:i w:val="0"/>
+                <w:iCs w:val="0"/>
+                <w:caps w:val="0"/>
+                <w:color w:val="000000" w:themeColor="text1"/>
+                <w:spacing w:val="0"/>
+                <w:sz w:val="24"/>
+                <w:szCs w:val="24"/>
+                <w:lang w:val="en-IN"/>
+                <w14:textFill>
+                  <w14:solidFill>
+                    <w14:schemeClr w14:val="tx1"/>
+                  </w14:solidFill>
+                </w14:textFill>
+              </w:rPr>
+            </w:pPr>
+            <w:r>
+              <w:rPr>
+                <w:rFonts w:hint="default" w:ascii="Times New Roman" w:hAnsi="Times New Roman" w:eastAsia="Segoe UI" w:cs="Times New Roman"/>
+                <w:b w:val="0"/>
+                <w:bCs/>
+                <w:i w:val="0"/>
+                <w:iCs w:val="0"/>
+                <w:caps w:val="0"/>
+                <w:color w:val="000000" w:themeColor="text1"/>
+                <w:spacing w:val="0"/>
+                <w:sz w:val="24"/>
+                <w:szCs w:val="24"/>
+                <w:lang w:val="en-IN"/>
+                <w14:textFill>
+                  <w14:solidFill>
+                    <w14:schemeClr w14:val="tx1"/>
+                  </w14:solidFill>
+                </w14:textFill>
+              </w:rPr>
+              <w:t>t</w:t>
+            </w:r>
+            <w:r>
+              <w:rPr>
+                <w:rFonts w:hint="default" w:ascii="Times New Roman" w:hAnsi="Times New Roman" w:eastAsia="Segoe UI" w:cs="Times New Roman"/>
+                <w:b w:val="0"/>
+                <w:bCs/>
+                <w:i w:val="0"/>
+                <w:iCs w:val="0"/>
+                <w:caps w:val="0"/>
+                <w:color w:val="000000" w:themeColor="text1"/>
+                <w:spacing w:val="0"/>
+                <w:sz w:val="24"/>
+                <w:szCs w:val="24"/>
+                <w14:textFill>
+                  <w14:solidFill>
+                    <w14:schemeClr w14:val="tx1"/>
+                  </w14:solidFill>
+                </w14:textFill>
+              </w:rPr>
+              <w:t>ext chunker splits large tex</w:t>
+            </w:r>
+            <w:r>
+              <w:rPr>
+                <w:rFonts w:hint="default" w:ascii="Times New Roman" w:hAnsi="Times New Roman" w:eastAsia="Segoe UI" w:cs="Times New Roman"/>
+                <w:b w:val="0"/>
+                <w:bCs/>
+                <w:i w:val="0"/>
+                <w:iCs w:val="0"/>
+                <w:caps w:val="0"/>
+                <w:color w:val="000000" w:themeColor="text1"/>
+                <w:spacing w:val="0"/>
+                <w:sz w:val="24"/>
+                <w:szCs w:val="24"/>
+                <w:lang w:val="en-IN"/>
+                <w14:textFill>
+                  <w14:solidFill>
+                    <w14:schemeClr w14:val="tx1"/>
+                  </w14:solidFill>
+                </w14:textFill>
+              </w:rPr>
+              <w:t>t</w:t>
+            </w:r>
+          </w:p>
+        </w:tc>
+        <w:tc>
+          <w:tcPr>
+            <w:tcW w:w="2329" w:type="dxa"/>
+          </w:tcPr>
+          <w:p>
+            <w:pPr>
+              <w:widowControl/>
+              <w:spacing w:after="160" w:line="360" w:lineRule="auto"/>
+              <w:jc w:val="center"/>
+              <w:rPr>
+                <w:rFonts w:hint="default" w:ascii="Times New Roman" w:hAnsi="Times New Roman" w:cs="Times New Roman"/>
+                <w:b w:val="0"/>
+                <w:bCs/>
+                <w:color w:val="000000" w:themeColor="text1"/>
+                <w:sz w:val="24"/>
+                <w:szCs w:val="24"/>
+                <w:vertAlign w:val="baseline"/>
+                <w:lang w:val="en-IN"/>
+                <w14:textFill>
+                  <w14:solidFill>
+                    <w14:schemeClr w14:val="tx1"/>
+                  </w14:solidFill>
+                </w14:textFill>
+              </w:rPr>
+            </w:pPr>
+            <w:r>
+              <w:rPr>
+                <w:rFonts w:hint="default" w:ascii="Times New Roman" w:hAnsi="Times New Roman" w:eastAsia="SimSun" w:cs="Times New Roman"/>
+                <w:b w:val="0"/>
+                <w:bCs/>
+                <w:color w:val="000000" w:themeColor="text1"/>
+                <w:sz w:val="24"/>
+                <w:szCs w:val="24"/>
+                <w14:textFill>
+                  <w14:solidFill>
+                    <w14:schemeClr w14:val="tx1"/>
+                  </w14:solidFill>
+                </w14:textFill>
+              </w:rPr>
+              <w:t>Passed</w:t>
+            </w:r>
+          </w:p>
+        </w:tc>
+      </w:tr>
+      <w:tr>
+        <w:tblPrEx>
+          <w:tblBorders>
+            <w:top w:val="single" w:color="auto" w:sz="4" w:space="0"/>
+            <w:left w:val="single" w:color="auto" w:sz="4" w:space="0"/>
+            <w:bottom w:val="single" w:color="auto" w:sz="4" w:space="0"/>
+            <w:right w:val="single" w:color="auto" w:sz="4" w:space="0"/>
+            <w:insideH w:val="single" w:color="auto" w:sz="4" w:space="0"/>
+            <w:insideV w:val="single" w:color="auto" w:sz="4" w:space="0"/>
+          </w:tblBorders>
+          <w:tblCellMar>
+            <w:left w:w="108" w:type="dxa"/>
+            <w:right w:w="108" w:type="dxa"/>
+          </w:tblCellMar>
+        </w:tblPrEx>
+        <w:tc>
+          <w:tcPr>
+            <w:tcW w:w="1008" w:type="dxa"/>
+          </w:tcPr>
+          <w:p>
+            <w:pPr>
+              <w:widowControl/>
+              <w:tabs>
+                <w:tab w:val="left" w:pos="2832"/>
+                <w:tab w:val="center" w:pos="5059"/>
+              </w:tabs>
+              <w:spacing w:after="160" w:line="360" w:lineRule="auto"/>
+              <w:jc w:val="center"/>
+              <w:rPr>
+                <w:rFonts w:hint="default" w:ascii="Times New Roman" w:hAnsi="Times New Roman" w:cs="Times New Roman"/>
+                <w:b w:val="0"/>
+                <w:bCs/>
+                <w:color w:val="000000" w:themeColor="text1"/>
+                <w:sz w:val="24"/>
+                <w:szCs w:val="24"/>
+                <w:vertAlign w:val="baseline"/>
+                <w:lang w:val="en-IN"/>
+                <w14:textFill>
+                  <w14:solidFill>
+                    <w14:schemeClr w14:val="tx1"/>
+                  </w14:solidFill>
+                </w14:textFill>
+              </w:rPr>
+            </w:pPr>
+            <w:r>
+              <w:rPr>
+                <w:rFonts w:hint="default" w:ascii="Times New Roman" w:hAnsi="Times New Roman" w:cs="Times New Roman"/>
+                <w:b w:val="0"/>
+                <w:bCs/>
+                <w:color w:val="000000" w:themeColor="text1"/>
+                <w:sz w:val="24"/>
+                <w:szCs w:val="24"/>
+                <w:vertAlign w:val="baseline"/>
+                <w:lang w:val="en-IN"/>
+                <w14:textFill>
+                  <w14:solidFill>
+                    <w14:schemeClr w14:val="tx1"/>
+                  </w14:solidFill>
+                </w14:textFill>
+              </w:rPr>
+              <w:t>8</w:t>
+            </w:r>
+          </w:p>
+        </w:tc>
+        <w:tc>
+          <w:tcPr>
+            <w:tcW w:w="6628" w:type="dxa"/>
+          </w:tcPr>
+          <w:p>
+            <w:pPr>
+              <w:widowControl/>
+              <w:tabs>
+                <w:tab w:val="left" w:pos="2832"/>
+                <w:tab w:val="center" w:pos="5059"/>
+              </w:tabs>
+              <w:spacing w:after="160" w:line="360" w:lineRule="auto"/>
+              <w:jc w:val="both"/>
+              <w:rPr>
+                <w:rFonts w:hint="default" w:ascii="Times New Roman" w:hAnsi="Times New Roman" w:eastAsia="Segoe UI" w:cs="Times New Roman"/>
+                <w:b w:val="0"/>
+                <w:bCs/>
+                <w:i w:val="0"/>
+                <w:iCs w:val="0"/>
+                <w:caps w:val="0"/>
+                <w:color w:val="000000" w:themeColor="text1"/>
+                <w:spacing w:val="0"/>
+                <w:sz w:val="24"/>
+                <w:szCs w:val="24"/>
+                <w:lang w:val="en-IN"/>
+                <w14:textFill>
+                  <w14:solidFill>
+                    <w14:schemeClr w14:val="tx1"/>
+                  </w14:solidFill>
+                </w14:textFill>
+              </w:rPr>
+            </w:pPr>
+            <w:r>
+              <w:rPr>
+                <w:rFonts w:hint="default" w:ascii="Times New Roman" w:hAnsi="Times New Roman" w:eastAsia="Segoe UI" w:cs="Times New Roman"/>
+                <w:b w:val="0"/>
+                <w:bCs/>
+                <w:i w:val="0"/>
+                <w:iCs w:val="0"/>
+                <w:caps w:val="0"/>
+                <w:color w:val="000000" w:themeColor="text1"/>
+                <w:spacing w:val="0"/>
+                <w:sz w:val="24"/>
+                <w:szCs w:val="24"/>
+                <w14:textFill>
+                  <w14:solidFill>
+                    <w14:schemeClr w14:val="tx1"/>
+                  </w14:solidFill>
+                </w14:textFill>
+              </w:rPr>
+              <w:t>Document analysis returns expected metric</w:t>
+            </w:r>
+            <w:r>
+              <w:rPr>
+                <w:rFonts w:hint="default" w:ascii="Times New Roman" w:hAnsi="Times New Roman" w:eastAsia="Segoe UI" w:cs="Times New Roman"/>
+                <w:b w:val="0"/>
+                <w:bCs/>
+                <w:i w:val="0"/>
+                <w:iCs w:val="0"/>
+                <w:caps w:val="0"/>
+                <w:color w:val="000000" w:themeColor="text1"/>
+                <w:spacing w:val="0"/>
+                <w:sz w:val="24"/>
+                <w:szCs w:val="24"/>
+                <w:lang w:val="en-IN"/>
+                <w14:textFill>
+                  <w14:solidFill>
+                    <w14:schemeClr w14:val="tx1"/>
+                  </w14:solidFill>
+                </w14:textFill>
+              </w:rPr>
+              <w:t>s</w:t>
+            </w:r>
+          </w:p>
+        </w:tc>
+        <w:tc>
+          <w:tcPr>
+            <w:tcW w:w="2329" w:type="dxa"/>
+          </w:tcPr>
+          <w:p>
+            <w:pPr>
+              <w:widowControl/>
+              <w:spacing w:after="160" w:line="360" w:lineRule="auto"/>
+              <w:jc w:val="center"/>
+              <w:rPr>
+                <w:rFonts w:hint="default" w:ascii="Times New Roman" w:hAnsi="Times New Roman" w:cs="Times New Roman"/>
+                <w:b w:val="0"/>
+                <w:bCs/>
+                <w:color w:val="000000" w:themeColor="text1"/>
+                <w:sz w:val="24"/>
+                <w:szCs w:val="24"/>
+                <w:vertAlign w:val="baseline"/>
+                <w:lang w:val="en-IN"/>
+                <w14:textFill>
+                  <w14:solidFill>
+                    <w14:schemeClr w14:val="tx1"/>
+                  </w14:solidFill>
+                </w14:textFill>
+              </w:rPr>
+            </w:pPr>
+            <w:r>
+              <w:rPr>
+                <w:rFonts w:hint="default" w:ascii="Times New Roman" w:hAnsi="Times New Roman" w:eastAsia="SimSun" w:cs="Times New Roman"/>
+                <w:b w:val="0"/>
+                <w:bCs/>
+                <w:color w:val="000000" w:themeColor="text1"/>
+                <w:sz w:val="24"/>
+                <w:szCs w:val="24"/>
+                <w14:textFill>
+                  <w14:solidFill>
+                    <w14:schemeClr w14:val="tx1"/>
+                  </w14:solidFill>
+                </w14:textFill>
+              </w:rPr>
+              <w:t>Passed</w:t>
+            </w:r>
+          </w:p>
+        </w:tc>
+      </w:tr>
+    </w:tbl>
+    <w:p>
+      <w:pPr>
+        <w:widowControl/>
+        <w:tabs>
+          <w:tab w:val="left" w:pos="2832"/>
+          <w:tab w:val="center" w:pos="5059"/>
+        </w:tabs>
+        <w:spacing w:after="160" w:line="360" w:lineRule="auto"/>
+        <w:jc w:val="both"/>
+        <w:rPr>
+          <w:rFonts w:hint="default"/>
+          <w:b/>
+          <w:sz w:val="28"/>
+          <w:szCs w:val="28"/>
+          <w:lang w:val="en-IN"/>
+        </w:rPr>
+      </w:pPr>
+    </w:p>
+    <w:p>
+      <w:pPr>
+        <w:widowControl/>
+        <w:tabs>
+          <w:tab w:val="left" w:pos="2832"/>
+          <w:tab w:val="center" w:pos="5059"/>
+        </w:tabs>
+        <w:spacing w:after="160" w:line="360" w:lineRule="auto"/>
+        <w:jc w:val="both"/>
+        <w:rPr>
+          <w:rFonts w:hint="default" w:eastAsia="SimSun" w:cs="Times New Roman"/>
+          <w:b/>
+          <w:bCs/>
+          <w:sz w:val="28"/>
+          <w:szCs w:val="28"/>
+          <w:lang w:val="en-IN"/>
+        </w:rPr>
+      </w:pPr>
+      <w:r>
+        <w:rPr>
+          <w:rFonts w:hint="default"/>
+          <w:b/>
+          <w:sz w:val="28"/>
+          <w:szCs w:val="28"/>
+          <w:lang w:val="en-IN"/>
+        </w:rPr>
+        <w:t xml:space="preserve">4. </w:t>
+      </w:r>
+      <w:r>
+        <w:rPr>
+          <w:rFonts w:hint="default" w:ascii="Times New Roman" w:hAnsi="Times New Roman" w:eastAsia="SimSun" w:cs="Times New Roman"/>
+          <w:b/>
+          <w:bCs/>
+          <w:sz w:val="28"/>
+          <w:szCs w:val="28"/>
+        </w:rPr>
+        <w:t>Performance Evaluation Table</w:t>
+      </w:r>
+      <w:r>
+        <w:rPr>
+          <w:rFonts w:hint="default" w:eastAsia="SimSun" w:cs="Times New Roman"/>
+          <w:b/>
+          <w:bCs/>
+          <w:sz w:val="28"/>
+          <w:szCs w:val="28"/>
+          <w:lang w:val="en-IN"/>
+        </w:rPr>
+        <w:t>:</w:t>
+      </w:r>
+    </w:p>
+    <w:tbl>
+      <w:tblPr>
+        <w:tblStyle w:val="15"/>
+        <w:tblW w:w="0" w:type="auto"/>
+        <w:tblInd w:w="0" w:type="dxa"/>
+        <w:tblBorders>
+          <w:top w:val="single" w:color="auto" w:sz="4" w:space="0"/>
+          <w:left w:val="single" w:color="auto" w:sz="4" w:space="0"/>
+          <w:bottom w:val="single" w:color="auto" w:sz="4" w:space="0"/>
+          <w:right w:val="single" w:color="auto" w:sz="4" w:space="0"/>
+          <w:insideH w:val="single" w:color="auto" w:sz="4" w:space="0"/>
+          <w:insideV w:val="single" w:color="auto" w:sz="4" w:space="0"/>
+        </w:tblBorders>
+        <w:tblLayout w:type="autofit"/>
+        <w:tblCellMar>
+          <w:top w:w="0" w:type="dxa"/>
+          <w:left w:w="108" w:type="dxa"/>
+          <w:bottom w:w="0" w:type="dxa"/>
+          <w:right w:w="108" w:type="dxa"/>
+        </w:tblCellMar>
+      </w:tblPr>
+      <w:tblGrid>
+        <w:gridCol w:w="998"/>
+        <w:gridCol w:w="5150"/>
+        <w:gridCol w:w="3817"/>
+      </w:tblGrid>
+      <w:tr>
+        <w:tblPrEx>
+          <w:tblBorders>
+            <w:top w:val="single" w:color="auto" w:sz="4" w:space="0"/>
+            <w:left w:val="single" w:color="auto" w:sz="4" w:space="0"/>
+            <w:bottom w:val="single" w:color="auto" w:sz="4" w:space="0"/>
+            <w:right w:val="single" w:color="auto" w:sz="4" w:space="0"/>
+            <w:insideH w:val="single" w:color="auto" w:sz="4" w:space="0"/>
+            <w:insideV w:val="single" w:color="auto" w:sz="4" w:space="0"/>
+          </w:tblBorders>
+          <w:tblCellMar>
+            <w:top w:w="0" w:type="dxa"/>
+            <w:left w:w="108" w:type="dxa"/>
+            <w:bottom w:w="0" w:type="dxa"/>
+            <w:right w:w="108" w:type="dxa"/>
+          </w:tblCellMar>
+        </w:tblPrEx>
+        <w:tc>
+          <w:tcPr>
+            <w:tcW w:w="998" w:type="dxa"/>
+          </w:tcPr>
+          <w:p>
+            <w:pPr>
+              <w:keepNext w:val="0"/>
+              <w:keepLines w:val="0"/>
+              <w:widowControl/>
+              <w:suppressLineNumbers w:val="0"/>
+              <w:tabs>
+                <w:tab w:val="left" w:pos="2832"/>
+                <w:tab w:val="center" w:pos="5059"/>
+              </w:tabs>
+              <w:spacing w:before="0" w:beforeAutospacing="0" w:after="160" w:afterAutospacing="0" w:line="360" w:lineRule="auto"/>
+              <w:ind w:left="0" w:right="0"/>
+              <w:jc w:val="both"/>
+              <w:rPr>
+                <w:rFonts w:hint="default" w:ascii="Times New Roman" w:hAnsi="Times New Roman" w:eastAsia="SimSun" w:cs="Times New Roman"/>
+                <w:b/>
+                <w:bCs/>
+                <w:sz w:val="24"/>
+                <w:szCs w:val="24"/>
+                <w:vertAlign w:val="baseline"/>
+                <w:lang w:val="en-IN"/>
+              </w:rPr>
+            </w:pPr>
+            <w:r>
+              <w:rPr>
+                <w:rFonts w:hint="default" w:ascii="Times New Roman" w:hAnsi="Times New Roman" w:eastAsia="SimSun" w:cs="Times New Roman"/>
+                <w:b/>
+                <w:bCs/>
+                <w:sz w:val="24"/>
+                <w:szCs w:val="24"/>
+                <w:vertAlign w:val="baseline"/>
+                <w:lang w:val="en-IN"/>
+              </w:rPr>
+              <w:t>Sr.No</w:t>
+            </w:r>
+          </w:p>
+        </w:tc>
+        <w:tc>
+          <w:tcPr>
+            <w:tcW w:w="5150" w:type="dxa"/>
+          </w:tcPr>
+          <w:p>
+            <w:pPr>
+              <w:keepNext w:val="0"/>
+              <w:keepLines w:val="0"/>
+              <w:widowControl/>
+              <w:suppressLineNumbers w:val="0"/>
+              <w:tabs>
+                <w:tab w:val="left" w:pos="2832"/>
+                <w:tab w:val="center" w:pos="5059"/>
+              </w:tabs>
+              <w:spacing w:before="0" w:beforeAutospacing="0" w:after="160" w:afterAutospacing="0" w:line="360" w:lineRule="auto"/>
+              <w:ind w:left="0" w:right="0"/>
+              <w:jc w:val="both"/>
+              <w:rPr>
+                <w:rFonts w:hint="default" w:ascii="Times New Roman" w:hAnsi="Times New Roman" w:eastAsia="SimSun" w:cs="Times New Roman"/>
+                <w:b/>
+                <w:bCs/>
+                <w:sz w:val="24"/>
+                <w:szCs w:val="24"/>
+                <w:vertAlign w:val="baseline"/>
+                <w:lang w:val="en-IN"/>
+              </w:rPr>
+            </w:pPr>
+            <w:r>
+              <w:rPr>
+                <w:rFonts w:hint="default" w:ascii="Times New Roman" w:hAnsi="Times New Roman" w:eastAsia="SimSun" w:cs="Times New Roman"/>
+                <w:b/>
+                <w:bCs/>
+                <w:sz w:val="24"/>
+                <w:szCs w:val="24"/>
+                <w:vertAlign w:val="baseline"/>
+                <w:lang w:val="en-IN"/>
+              </w:rPr>
+              <w:t>Evaluation Metric</w:t>
+            </w:r>
+          </w:p>
+        </w:tc>
+        <w:tc>
+          <w:tcPr>
+            <w:tcW w:w="3817" w:type="dxa"/>
+          </w:tcPr>
+          <w:p>
+            <w:pPr>
+              <w:keepNext w:val="0"/>
+              <w:keepLines w:val="0"/>
+              <w:widowControl/>
+              <w:suppressLineNumbers w:val="0"/>
+              <w:tabs>
+                <w:tab w:val="left" w:pos="2832"/>
+                <w:tab w:val="center" w:pos="5059"/>
+              </w:tabs>
+              <w:spacing w:before="0" w:beforeAutospacing="0" w:after="160" w:afterAutospacing="0" w:line="360" w:lineRule="auto"/>
+              <w:ind w:left="0" w:right="0"/>
+              <w:jc w:val="both"/>
+              <w:rPr>
+                <w:rFonts w:hint="default" w:ascii="Times New Roman" w:hAnsi="Times New Roman" w:eastAsia="SimSun" w:cs="Times New Roman"/>
+                <w:b/>
+                <w:bCs/>
+                <w:sz w:val="24"/>
+                <w:szCs w:val="24"/>
+                <w:vertAlign w:val="baseline"/>
+                <w:lang w:val="en-IN"/>
+              </w:rPr>
+            </w:pPr>
+            <w:r>
+              <w:rPr>
+                <w:rFonts w:hint="default" w:ascii="Times New Roman" w:hAnsi="Times New Roman" w:eastAsia="SimSun" w:cs="Times New Roman"/>
+                <w:b/>
+                <w:bCs/>
+                <w:sz w:val="24"/>
+                <w:szCs w:val="24"/>
+                <w:vertAlign w:val="baseline"/>
+                <w:lang w:val="en-IN"/>
+              </w:rPr>
+              <w:t>Value’s</w:t>
+            </w:r>
+          </w:p>
+        </w:tc>
+      </w:tr>
+      <w:tr>
+        <w:tblPrEx>
+          <w:tblBorders>
+            <w:top w:val="single" w:color="auto" w:sz="4" w:space="0"/>
+            <w:left w:val="single" w:color="auto" w:sz="4" w:space="0"/>
+            <w:bottom w:val="single" w:color="auto" w:sz="4" w:space="0"/>
+            <w:right w:val="single" w:color="auto" w:sz="4" w:space="0"/>
+            <w:insideH w:val="single" w:color="auto" w:sz="4" w:space="0"/>
+            <w:insideV w:val="single" w:color="auto" w:sz="4" w:space="0"/>
+          </w:tblBorders>
+          <w:tblCellMar>
+            <w:top w:w="0" w:type="dxa"/>
+            <w:left w:w="108" w:type="dxa"/>
+            <w:bottom w:w="0" w:type="dxa"/>
+            <w:right w:w="108" w:type="dxa"/>
+          </w:tblCellMar>
+        </w:tblPrEx>
+        <w:tc>
+          <w:tcPr>
+            <w:tcW w:w="998" w:type="dxa"/>
+          </w:tcPr>
+          <w:p>
+            <w:pPr>
+              <w:keepNext w:val="0"/>
+              <w:keepLines w:val="0"/>
+              <w:widowControl/>
+              <w:suppressLineNumbers w:val="0"/>
+              <w:tabs>
+                <w:tab w:val="left" w:pos="2832"/>
+                <w:tab w:val="center" w:pos="5059"/>
+              </w:tabs>
+              <w:spacing w:before="0" w:beforeAutospacing="0" w:after="160" w:afterAutospacing="0" w:line="360" w:lineRule="auto"/>
+              <w:ind w:left="0" w:right="0"/>
+              <w:jc w:val="center"/>
+              <w:rPr>
+                <w:rFonts w:hint="default" w:ascii="Times New Roman" w:hAnsi="Times New Roman" w:eastAsia="SimSun" w:cs="Times New Roman"/>
+                <w:b w:val="0"/>
+                <w:bCs w:val="0"/>
+                <w:sz w:val="24"/>
+                <w:szCs w:val="24"/>
+                <w:vertAlign w:val="baseline"/>
+                <w:lang w:val="en-IN"/>
+              </w:rPr>
+            </w:pPr>
+            <w:r>
+              <w:rPr>
+                <w:rFonts w:hint="default" w:ascii="Times New Roman" w:hAnsi="Times New Roman" w:eastAsia="SimSun" w:cs="Times New Roman"/>
+                <w:b w:val="0"/>
+                <w:bCs w:val="0"/>
+                <w:sz w:val="24"/>
+                <w:szCs w:val="24"/>
+                <w:vertAlign w:val="baseline"/>
+                <w:lang w:val="en-IN"/>
+              </w:rPr>
+              <w:t>1</w:t>
+            </w:r>
+          </w:p>
+        </w:tc>
+        <w:tc>
+          <w:tcPr>
+            <w:tcW w:w="5150" w:type="dxa"/>
+          </w:tcPr>
+          <w:p>
+            <w:pPr>
+              <w:keepNext w:val="0"/>
+              <w:keepLines w:val="0"/>
+              <w:widowControl/>
+              <w:suppressLineNumbers w:val="0"/>
+              <w:tabs>
+                <w:tab w:val="left" w:pos="2832"/>
+                <w:tab w:val="center" w:pos="5059"/>
+              </w:tabs>
+              <w:spacing w:before="0" w:beforeAutospacing="0" w:after="160" w:afterAutospacing="0" w:line="360" w:lineRule="auto"/>
+              <w:ind w:left="0" w:right="0"/>
+              <w:jc w:val="both"/>
+              <w:rPr>
+                <w:rFonts w:hint="default" w:ascii="Times New Roman" w:hAnsi="Times New Roman" w:eastAsia="SimSun" w:cs="Times New Roman"/>
+                <w:b/>
+                <w:bCs/>
+                <w:sz w:val="24"/>
+                <w:szCs w:val="24"/>
+                <w:vertAlign w:val="baseline"/>
+                <w:lang w:val="en-IN"/>
+              </w:rPr>
+            </w:pPr>
+            <w:r>
+              <w:rPr>
+                <w:rFonts w:hint="default" w:ascii="Times New Roman" w:hAnsi="Times New Roman" w:eastAsia="SimSun" w:cs="Times New Roman"/>
+                <w:sz w:val="24"/>
+                <w:szCs w:val="24"/>
+              </w:rPr>
+              <w:t>Query–Law Mapping Accuracy</w:t>
+            </w:r>
+          </w:p>
+        </w:tc>
+        <w:tc>
+          <w:tcPr>
+            <w:tcW w:w="3817" w:type="dxa"/>
+          </w:tcPr>
+          <w:p>
+            <w:pPr>
+              <w:keepNext w:val="0"/>
+              <w:keepLines w:val="0"/>
+              <w:widowControl/>
+              <w:suppressLineNumbers w:val="0"/>
+              <w:tabs>
+                <w:tab w:val="left" w:pos="2832"/>
+                <w:tab w:val="center" w:pos="5059"/>
+              </w:tabs>
+              <w:spacing w:before="0" w:beforeAutospacing="0" w:after="160" w:afterAutospacing="0" w:line="360" w:lineRule="auto"/>
+              <w:ind w:left="0" w:right="0"/>
+              <w:jc w:val="both"/>
+              <w:rPr>
+                <w:rFonts w:hint="default" w:ascii="Times New Roman" w:hAnsi="Times New Roman" w:eastAsia="SimSun" w:cs="Times New Roman"/>
+                <w:b/>
+                <w:bCs/>
+                <w:sz w:val="24"/>
+                <w:szCs w:val="24"/>
+                <w:vertAlign w:val="baseline"/>
+                <w:lang w:val="en-IN"/>
+              </w:rPr>
+            </w:pPr>
+            <w:r>
+              <w:rPr>
+                <w:rFonts w:hint="default" w:ascii="Times New Roman" w:hAnsi="Times New Roman" w:eastAsia="SimSun" w:cs="Times New Roman"/>
+                <w:sz w:val="24"/>
+                <w:szCs w:val="24"/>
+              </w:rPr>
+              <w:t>82-87%</w:t>
+            </w:r>
+          </w:p>
+        </w:tc>
+      </w:tr>
+      <w:tr>
+        <w:tblPrEx>
+          <w:tblBorders>
+            <w:top w:val="single" w:color="auto" w:sz="4" w:space="0"/>
+            <w:left w:val="single" w:color="auto" w:sz="4" w:space="0"/>
+            <w:bottom w:val="single" w:color="auto" w:sz="4" w:space="0"/>
+            <w:right w:val="single" w:color="auto" w:sz="4" w:space="0"/>
+            <w:insideH w:val="single" w:color="auto" w:sz="4" w:space="0"/>
+            <w:insideV w:val="single" w:color="auto" w:sz="4" w:space="0"/>
+          </w:tblBorders>
+          <w:tblCellMar>
+            <w:top w:w="0" w:type="dxa"/>
+            <w:left w:w="108" w:type="dxa"/>
+            <w:bottom w:w="0" w:type="dxa"/>
+            <w:right w:w="108" w:type="dxa"/>
+          </w:tblCellMar>
+        </w:tblPrEx>
+        <w:tc>
+          <w:tcPr>
+            <w:tcW w:w="998" w:type="dxa"/>
+          </w:tcPr>
+          <w:p>
+            <w:pPr>
+              <w:keepNext w:val="0"/>
+              <w:keepLines w:val="0"/>
+              <w:widowControl/>
+              <w:suppressLineNumbers w:val="0"/>
+              <w:tabs>
+                <w:tab w:val="left" w:pos="2832"/>
+                <w:tab w:val="center" w:pos="5059"/>
+              </w:tabs>
+              <w:spacing w:before="0" w:beforeAutospacing="0" w:after="160" w:afterAutospacing="0" w:line="360" w:lineRule="auto"/>
+              <w:ind w:left="0" w:right="0"/>
+              <w:jc w:val="center"/>
+              <w:rPr>
+                <w:rFonts w:hint="default" w:ascii="Times New Roman" w:hAnsi="Times New Roman" w:eastAsia="SimSun" w:cs="Times New Roman"/>
+                <w:b w:val="0"/>
+                <w:bCs w:val="0"/>
+                <w:sz w:val="24"/>
+                <w:szCs w:val="24"/>
+                <w:vertAlign w:val="baseline"/>
+                <w:lang w:val="en-IN"/>
+              </w:rPr>
+            </w:pPr>
+            <w:r>
+              <w:rPr>
+                <w:rFonts w:hint="default" w:ascii="Times New Roman" w:hAnsi="Times New Roman" w:eastAsia="SimSun" w:cs="Times New Roman"/>
+                <w:b w:val="0"/>
+                <w:bCs w:val="0"/>
+                <w:sz w:val="24"/>
+                <w:szCs w:val="24"/>
+                <w:vertAlign w:val="baseline"/>
+                <w:lang w:val="en-IN"/>
+              </w:rPr>
+              <w:t>2</w:t>
+            </w:r>
+          </w:p>
+        </w:tc>
+        <w:tc>
+          <w:tcPr>
+            <w:tcW w:w="5150" w:type="dxa"/>
+          </w:tcPr>
+          <w:p>
+            <w:pPr>
+              <w:keepNext w:val="0"/>
+              <w:keepLines w:val="0"/>
+              <w:widowControl/>
+              <w:suppressLineNumbers w:val="0"/>
+              <w:tabs>
+                <w:tab w:val="left" w:pos="2832"/>
+                <w:tab w:val="center" w:pos="5059"/>
+              </w:tabs>
+              <w:spacing w:before="0" w:beforeAutospacing="0" w:after="160" w:afterAutospacing="0" w:line="360" w:lineRule="auto"/>
+              <w:ind w:left="0" w:right="0"/>
+              <w:jc w:val="both"/>
+              <w:rPr>
+                <w:rFonts w:hint="default" w:ascii="Times New Roman" w:hAnsi="Times New Roman" w:eastAsia="SimSun" w:cs="Times New Roman"/>
+                <w:b/>
+                <w:bCs/>
+                <w:sz w:val="24"/>
+                <w:szCs w:val="24"/>
+                <w:vertAlign w:val="baseline"/>
+                <w:lang w:val="en-IN"/>
+              </w:rPr>
+            </w:pPr>
+            <w:r>
+              <w:rPr>
+                <w:rFonts w:hint="default" w:ascii="Times New Roman" w:hAnsi="Times New Roman" w:eastAsia="SimSun" w:cs="Times New Roman"/>
+                <w:sz w:val="24"/>
+                <w:szCs w:val="24"/>
+              </w:rPr>
+              <w:t>Average Response Time</w:t>
+            </w:r>
+          </w:p>
+        </w:tc>
+        <w:tc>
+          <w:tcPr>
+            <w:tcW w:w="3817" w:type="dxa"/>
+          </w:tcPr>
+          <w:p>
+            <w:pPr>
+              <w:keepNext w:val="0"/>
+              <w:keepLines w:val="0"/>
+              <w:widowControl/>
+              <w:suppressLineNumbers w:val="0"/>
+              <w:tabs>
+                <w:tab w:val="left" w:pos="2832"/>
+                <w:tab w:val="center" w:pos="5059"/>
+              </w:tabs>
+              <w:spacing w:before="0" w:beforeAutospacing="0" w:after="160" w:afterAutospacing="0" w:line="360" w:lineRule="auto"/>
+              <w:ind w:left="0" w:right="0"/>
+              <w:jc w:val="both"/>
+              <w:rPr>
+                <w:rFonts w:hint="default" w:ascii="Times New Roman" w:hAnsi="Times New Roman" w:eastAsia="SimSun" w:cs="Times New Roman"/>
+                <w:b/>
+                <w:bCs/>
+                <w:sz w:val="24"/>
+                <w:szCs w:val="24"/>
+                <w:vertAlign w:val="baseline"/>
+                <w:lang w:val="en-IN"/>
+              </w:rPr>
+            </w:pPr>
+            <w:r>
+              <w:rPr>
+                <w:rFonts w:hint="default" w:ascii="Times New Roman" w:hAnsi="Times New Roman" w:eastAsia="SimSun" w:cs="Times New Roman"/>
+                <w:sz w:val="24"/>
+                <w:szCs w:val="24"/>
+              </w:rPr>
+              <w:t>2-4 Sec</w:t>
+            </w:r>
+          </w:p>
+        </w:tc>
+      </w:tr>
+      <w:tr>
+        <w:tblPrEx>
+          <w:tblBorders>
+            <w:top w:val="single" w:color="auto" w:sz="4" w:space="0"/>
+            <w:left w:val="single" w:color="auto" w:sz="4" w:space="0"/>
+            <w:bottom w:val="single" w:color="auto" w:sz="4" w:space="0"/>
+            <w:right w:val="single" w:color="auto" w:sz="4" w:space="0"/>
+            <w:insideH w:val="single" w:color="auto" w:sz="4" w:space="0"/>
+            <w:insideV w:val="single" w:color="auto" w:sz="4" w:space="0"/>
+          </w:tblBorders>
+          <w:tblCellMar>
+            <w:top w:w="0" w:type="dxa"/>
+            <w:left w:w="108" w:type="dxa"/>
+            <w:bottom w:w="0" w:type="dxa"/>
+            <w:right w:w="108" w:type="dxa"/>
+          </w:tblCellMar>
+        </w:tblPrEx>
+        <w:tc>
+          <w:tcPr>
+            <w:tcW w:w="998" w:type="dxa"/>
+          </w:tcPr>
+          <w:p>
+            <w:pPr>
+              <w:keepNext w:val="0"/>
+              <w:keepLines w:val="0"/>
+              <w:widowControl/>
+              <w:suppressLineNumbers w:val="0"/>
+              <w:tabs>
+                <w:tab w:val="left" w:pos="2832"/>
+                <w:tab w:val="center" w:pos="5059"/>
+              </w:tabs>
+              <w:spacing w:before="0" w:beforeAutospacing="0" w:after="160" w:afterAutospacing="0" w:line="360" w:lineRule="auto"/>
+              <w:ind w:left="0" w:right="0"/>
+              <w:jc w:val="center"/>
+              <w:rPr>
+                <w:rFonts w:hint="default" w:ascii="Times New Roman" w:hAnsi="Times New Roman" w:eastAsia="SimSun" w:cs="Times New Roman"/>
+                <w:b w:val="0"/>
+                <w:bCs w:val="0"/>
+                <w:sz w:val="24"/>
+                <w:szCs w:val="24"/>
+                <w:vertAlign w:val="baseline"/>
+                <w:lang w:val="en-IN"/>
+              </w:rPr>
+            </w:pPr>
+            <w:r>
+              <w:rPr>
+                <w:rFonts w:hint="default" w:ascii="Times New Roman" w:hAnsi="Times New Roman" w:eastAsia="SimSun" w:cs="Times New Roman"/>
+                <w:b w:val="0"/>
+                <w:bCs w:val="0"/>
+                <w:sz w:val="24"/>
+                <w:szCs w:val="24"/>
+                <w:vertAlign w:val="baseline"/>
+                <w:lang w:val="en-IN"/>
+              </w:rPr>
+              <w:t>3</w:t>
+            </w:r>
+          </w:p>
+        </w:tc>
+        <w:tc>
+          <w:tcPr>
+            <w:tcW w:w="5150" w:type="dxa"/>
+          </w:tcPr>
+          <w:p>
+            <w:pPr>
+              <w:keepNext w:val="0"/>
+              <w:keepLines w:val="0"/>
+              <w:widowControl/>
+              <w:suppressLineNumbers w:val="0"/>
+              <w:tabs>
+                <w:tab w:val="left" w:pos="2832"/>
+                <w:tab w:val="center" w:pos="5059"/>
+              </w:tabs>
+              <w:spacing w:before="0" w:beforeAutospacing="0" w:after="160" w:afterAutospacing="0" w:line="360" w:lineRule="auto"/>
+              <w:ind w:left="0" w:right="0"/>
+              <w:jc w:val="both"/>
+              <w:rPr>
+                <w:rFonts w:hint="default" w:ascii="Times New Roman" w:hAnsi="Times New Roman" w:eastAsia="SimSun" w:cs="Times New Roman"/>
+                <w:sz w:val="24"/>
+                <w:szCs w:val="24"/>
+              </w:rPr>
+            </w:pPr>
+            <w:r>
+              <w:rPr>
+                <w:rFonts w:hint="default" w:ascii="Times New Roman" w:hAnsi="Times New Roman" w:eastAsia="SimSun" w:cs="Times New Roman"/>
+                <w:sz w:val="24"/>
+                <w:szCs w:val="24"/>
+              </w:rPr>
+              <w:t>Supported Language</w:t>
+            </w:r>
+          </w:p>
+        </w:tc>
+        <w:tc>
+          <w:tcPr>
+            <w:tcW w:w="3817" w:type="dxa"/>
+          </w:tcPr>
+          <w:p>
+            <w:pPr>
+              <w:keepNext w:val="0"/>
+              <w:keepLines w:val="0"/>
+              <w:widowControl/>
+              <w:suppressLineNumbers w:val="0"/>
+              <w:tabs>
+                <w:tab w:val="left" w:pos="2832"/>
+                <w:tab w:val="center" w:pos="5059"/>
+              </w:tabs>
+              <w:spacing w:before="0" w:beforeAutospacing="0" w:after="160" w:afterAutospacing="0" w:line="360" w:lineRule="auto"/>
+              <w:ind w:left="0" w:right="0"/>
+              <w:jc w:val="both"/>
+              <w:rPr>
+                <w:rFonts w:hint="default" w:ascii="Times New Roman" w:hAnsi="Times New Roman" w:eastAsia="SimSun" w:cs="Times New Roman"/>
+                <w:b/>
+                <w:bCs/>
+                <w:sz w:val="24"/>
+                <w:szCs w:val="24"/>
+                <w:vertAlign w:val="baseline"/>
+                <w:lang w:val="en-IN"/>
+              </w:rPr>
+            </w:pPr>
+            <w:r>
+              <w:rPr>
+                <w:rFonts w:hint="default" w:ascii="Times New Roman" w:hAnsi="Times New Roman" w:eastAsia="SimSun" w:cs="Times New Roman"/>
+                <w:sz w:val="24"/>
+                <w:szCs w:val="24"/>
+              </w:rPr>
+              <w:t>Hin,Mar,Eng</w:t>
+            </w:r>
+          </w:p>
+        </w:tc>
+      </w:tr>
+      <w:tr>
+        <w:tblPrEx>
+          <w:tblBorders>
+            <w:top w:val="single" w:color="auto" w:sz="4" w:space="0"/>
+            <w:left w:val="single" w:color="auto" w:sz="4" w:space="0"/>
+            <w:bottom w:val="single" w:color="auto" w:sz="4" w:space="0"/>
+            <w:right w:val="single" w:color="auto" w:sz="4" w:space="0"/>
+            <w:insideH w:val="single" w:color="auto" w:sz="4" w:space="0"/>
+            <w:insideV w:val="single" w:color="auto" w:sz="4" w:space="0"/>
+          </w:tblBorders>
+          <w:tblCellMar>
+            <w:top w:w="0" w:type="dxa"/>
+            <w:left w:w="108" w:type="dxa"/>
+            <w:bottom w:w="0" w:type="dxa"/>
+            <w:right w:w="108" w:type="dxa"/>
+          </w:tblCellMar>
+        </w:tblPrEx>
+        <w:tc>
+          <w:tcPr>
+            <w:tcW w:w="998" w:type="dxa"/>
+          </w:tcPr>
+          <w:p>
+            <w:pPr>
+              <w:keepNext w:val="0"/>
+              <w:keepLines w:val="0"/>
+              <w:widowControl/>
+              <w:suppressLineNumbers w:val="0"/>
+              <w:tabs>
+                <w:tab w:val="left" w:pos="2832"/>
+                <w:tab w:val="center" w:pos="5059"/>
+              </w:tabs>
+              <w:spacing w:before="0" w:beforeAutospacing="0" w:after="160" w:afterAutospacing="0" w:line="360" w:lineRule="auto"/>
+              <w:ind w:left="0" w:right="0"/>
+              <w:jc w:val="center"/>
+              <w:rPr>
+                <w:rFonts w:hint="default" w:ascii="Times New Roman" w:hAnsi="Times New Roman" w:eastAsia="SimSun" w:cs="Times New Roman"/>
+                <w:b w:val="0"/>
+                <w:bCs w:val="0"/>
+                <w:sz w:val="24"/>
+                <w:szCs w:val="24"/>
+                <w:vertAlign w:val="baseline"/>
+                <w:lang w:val="en-IN"/>
+              </w:rPr>
+            </w:pPr>
+            <w:r>
+              <w:rPr>
+                <w:rFonts w:hint="default" w:ascii="Times New Roman" w:hAnsi="Times New Roman" w:eastAsia="SimSun" w:cs="Times New Roman"/>
+                <w:b w:val="0"/>
+                <w:bCs w:val="0"/>
+                <w:sz w:val="24"/>
+                <w:szCs w:val="24"/>
+                <w:vertAlign w:val="baseline"/>
+                <w:lang w:val="en-IN"/>
+              </w:rPr>
+              <w:t>4</w:t>
+            </w:r>
+          </w:p>
+        </w:tc>
+        <w:tc>
+          <w:tcPr>
+            <w:tcW w:w="5150" w:type="dxa"/>
+          </w:tcPr>
+          <w:p>
+            <w:pPr>
+              <w:keepNext w:val="0"/>
+              <w:keepLines w:val="0"/>
+              <w:widowControl/>
+              <w:suppressLineNumbers w:val="0"/>
+              <w:tabs>
+                <w:tab w:val="left" w:pos="2832"/>
+                <w:tab w:val="center" w:pos="5059"/>
+              </w:tabs>
+              <w:spacing w:before="0" w:beforeAutospacing="0" w:after="160" w:afterAutospacing="0" w:line="360" w:lineRule="auto"/>
+              <w:ind w:left="0" w:right="0"/>
+              <w:jc w:val="both"/>
+              <w:rPr>
+                <w:rFonts w:hint="default" w:ascii="Times New Roman" w:hAnsi="Times New Roman" w:eastAsia="SimSun" w:cs="Times New Roman"/>
+                <w:sz w:val="24"/>
+                <w:szCs w:val="24"/>
+              </w:rPr>
+            </w:pPr>
+            <w:r>
+              <w:rPr>
+                <w:rFonts w:hint="default" w:ascii="Times New Roman" w:hAnsi="Times New Roman" w:eastAsia="SimSun" w:cs="Times New Roman"/>
+                <w:sz w:val="24"/>
+                <w:szCs w:val="24"/>
+              </w:rPr>
+              <w:t>Queries Tested</w:t>
+            </w:r>
+          </w:p>
+        </w:tc>
+        <w:tc>
+          <w:tcPr>
+            <w:tcW w:w="3817" w:type="dxa"/>
+          </w:tcPr>
+          <w:p>
+            <w:pPr>
+              <w:keepNext w:val="0"/>
+              <w:keepLines w:val="0"/>
+              <w:widowControl/>
+              <w:suppressLineNumbers w:val="0"/>
+              <w:tabs>
+                <w:tab w:val="left" w:pos="2832"/>
+                <w:tab w:val="center" w:pos="5059"/>
+              </w:tabs>
+              <w:spacing w:before="0" w:beforeAutospacing="0" w:after="160" w:afterAutospacing="0" w:line="360" w:lineRule="auto"/>
+              <w:ind w:left="0" w:right="0"/>
+              <w:jc w:val="both"/>
+              <w:rPr>
+                <w:rFonts w:hint="default" w:ascii="Times New Roman" w:hAnsi="Times New Roman" w:eastAsia="SimSun" w:cs="Times New Roman"/>
+                <w:b w:val="0"/>
+                <w:bCs w:val="0"/>
+                <w:sz w:val="24"/>
+                <w:szCs w:val="24"/>
+                <w:vertAlign w:val="baseline"/>
+                <w:lang w:val="en-IN"/>
+              </w:rPr>
+            </w:pPr>
+            <w:r>
+              <w:rPr>
+                <w:rFonts w:hint="default" w:eastAsia="SimSun" w:cs="Times New Roman"/>
+                <w:b w:val="0"/>
+                <w:bCs w:val="0"/>
+                <w:sz w:val="24"/>
+                <w:szCs w:val="24"/>
+                <w:vertAlign w:val="baseline"/>
+                <w:lang w:val="en-IN"/>
+              </w:rPr>
+              <w:t>2000+</w:t>
+            </w:r>
+          </w:p>
+        </w:tc>
+      </w:tr>
+    </w:tbl>
+    <w:p>
+      <w:pPr>
+        <w:widowControl/>
+        <w:tabs>
+          <w:tab w:val="left" w:pos="2832"/>
+          <w:tab w:val="center" w:pos="5059"/>
+        </w:tabs>
+        <w:spacing w:after="160" w:line="360" w:lineRule="auto"/>
+        <w:jc w:val="both"/>
+        <w:rPr>
+          <w:rFonts w:hint="default" w:eastAsia="SimSun" w:cs="Times New Roman"/>
+          <w:b/>
+          <w:bCs/>
+          <w:sz w:val="24"/>
+          <w:szCs w:val="24"/>
           <w:lang w:val="en-IN"/>
         </w:rPr>
       </w:pPr>
@@ -34446,7 +37537,7 @@
           <w:tab w:val="center" w:pos="5059"/>
         </w:tabs>
         <w:spacing w:after="160" w:line="360" w:lineRule="auto"/>
-        <w:jc w:val="center"/>
+        <w:jc w:val="both"/>
         <w:rPr>
           <w:rFonts w:hint="default"/>
           <w:b/>
@@ -34455,276 +37546,8 @@
           <w:lang w:val="en-IN"/>
         </w:rPr>
       </w:pPr>
-    </w:p>
-    <w:p>
-      <w:pPr>
-        <w:widowControl/>
-        <w:tabs>
-          <w:tab w:val="left" w:pos="2832"/>
-          <w:tab w:val="center" w:pos="5059"/>
-        </w:tabs>
-        <w:spacing w:after="160" w:line="360" w:lineRule="auto"/>
-        <w:jc w:val="center"/>
-        <w:rPr>
-          <w:rFonts w:hint="default"/>
-          <w:b/>
-          <w:sz w:val="32"/>
-          <w:szCs w:val="32"/>
-          <w:lang w:val="en-IN"/>
-        </w:rPr>
-      </w:pPr>
-    </w:p>
-    <w:p>
-      <w:pPr>
-        <w:widowControl/>
-        <w:tabs>
-          <w:tab w:val="left" w:pos="2832"/>
-          <w:tab w:val="center" w:pos="5059"/>
-        </w:tabs>
-        <w:spacing w:after="160" w:line="360" w:lineRule="auto"/>
-        <w:jc w:val="center"/>
-        <w:rPr>
-          <w:rFonts w:hint="default"/>
-          <w:b/>
-          <w:sz w:val="32"/>
-          <w:szCs w:val="32"/>
-          <w:lang w:val="en-IN"/>
-        </w:rPr>
-      </w:pPr>
-    </w:p>
-    <w:p>
-      <w:pPr>
-        <w:widowControl/>
-        <w:tabs>
-          <w:tab w:val="left" w:pos="2832"/>
-          <w:tab w:val="center" w:pos="5059"/>
-        </w:tabs>
-        <w:spacing w:after="160" w:line="360" w:lineRule="auto"/>
-        <w:jc w:val="center"/>
-        <w:rPr>
-          <w:rFonts w:hint="default"/>
-          <w:b/>
-          <w:sz w:val="32"/>
-          <w:szCs w:val="32"/>
-          <w:lang w:val="en-IN"/>
-        </w:rPr>
-      </w:pPr>
-    </w:p>
-    <w:p>
-      <w:pPr>
-        <w:widowControl/>
-        <w:tabs>
-          <w:tab w:val="left" w:pos="2832"/>
-          <w:tab w:val="center" w:pos="5059"/>
-        </w:tabs>
-        <w:spacing w:after="160" w:line="360" w:lineRule="auto"/>
-        <w:jc w:val="center"/>
-        <w:rPr>
-          <w:rFonts w:hint="default"/>
-          <w:b/>
-          <w:sz w:val="32"/>
-          <w:szCs w:val="32"/>
-          <w:lang w:val="en-IN"/>
-        </w:rPr>
-      </w:pPr>
-    </w:p>
-    <w:p>
-      <w:pPr>
-        <w:widowControl/>
-        <w:tabs>
-          <w:tab w:val="left" w:pos="2832"/>
-          <w:tab w:val="center" w:pos="5059"/>
-        </w:tabs>
-        <w:spacing w:after="160" w:line="360" w:lineRule="auto"/>
-        <w:jc w:val="center"/>
-        <w:rPr>
-          <w:rFonts w:hint="default"/>
-          <w:b/>
-          <w:sz w:val="32"/>
-          <w:szCs w:val="32"/>
-          <w:lang w:val="en-IN"/>
-        </w:rPr>
-      </w:pPr>
-    </w:p>
-    <w:p>
-      <w:pPr>
-        <w:widowControl/>
-        <w:tabs>
-          <w:tab w:val="left" w:pos="2832"/>
-          <w:tab w:val="center" w:pos="5059"/>
-        </w:tabs>
-        <w:spacing w:after="160" w:line="360" w:lineRule="auto"/>
-        <w:jc w:val="center"/>
-        <w:rPr>
-          <w:rFonts w:hint="default"/>
-          <w:b/>
-          <w:sz w:val="32"/>
-          <w:szCs w:val="32"/>
-          <w:lang w:val="en-IN"/>
-        </w:rPr>
-      </w:pPr>
-    </w:p>
-    <w:p>
-      <w:pPr>
-        <w:widowControl/>
-        <w:tabs>
-          <w:tab w:val="left" w:pos="2832"/>
-          <w:tab w:val="center" w:pos="5059"/>
-        </w:tabs>
-        <w:spacing w:after="160" w:line="360" w:lineRule="auto"/>
-        <w:jc w:val="center"/>
-        <w:rPr>
-          <w:rFonts w:hint="default"/>
-          <w:b/>
-          <w:sz w:val="32"/>
-          <w:szCs w:val="32"/>
-          <w:lang w:val="en-IN"/>
-        </w:rPr>
-      </w:pPr>
-    </w:p>
-    <w:p>
-      <w:pPr>
-        <w:widowControl/>
-        <w:tabs>
-          <w:tab w:val="left" w:pos="2832"/>
-          <w:tab w:val="center" w:pos="5059"/>
-        </w:tabs>
-        <w:spacing w:after="160" w:line="360" w:lineRule="auto"/>
-        <w:jc w:val="center"/>
-        <w:rPr>
-          <w:rFonts w:hint="default"/>
-          <w:b/>
-          <w:sz w:val="32"/>
-          <w:szCs w:val="32"/>
-          <w:lang w:val="en-IN"/>
-        </w:rPr>
-      </w:pPr>
-    </w:p>
-    <w:p>
-      <w:pPr>
-        <w:widowControl/>
-        <w:tabs>
-          <w:tab w:val="left" w:pos="2832"/>
-          <w:tab w:val="center" w:pos="5059"/>
-        </w:tabs>
-        <w:spacing w:after="160" w:line="360" w:lineRule="auto"/>
-        <w:jc w:val="center"/>
-        <w:rPr>
-          <w:rFonts w:hint="default"/>
-          <w:b/>
-          <w:sz w:val="32"/>
-          <w:szCs w:val="32"/>
-          <w:lang w:val="en-IN"/>
-        </w:rPr>
-      </w:pPr>
-    </w:p>
-    <w:p>
-      <w:pPr>
-        <w:widowControl/>
-        <w:tabs>
-          <w:tab w:val="left" w:pos="2832"/>
-          <w:tab w:val="center" w:pos="5059"/>
-        </w:tabs>
-        <w:spacing w:after="160" w:line="360" w:lineRule="auto"/>
-        <w:jc w:val="center"/>
-        <w:rPr>
-          <w:rFonts w:hint="default"/>
-          <w:b/>
-          <w:sz w:val="32"/>
-          <w:szCs w:val="32"/>
-          <w:lang w:val="en-IN"/>
-        </w:rPr>
-      </w:pPr>
-    </w:p>
-    <w:p>
-      <w:pPr>
-        <w:widowControl/>
-        <w:tabs>
-          <w:tab w:val="left" w:pos="2832"/>
-          <w:tab w:val="center" w:pos="5059"/>
-        </w:tabs>
-        <w:spacing w:after="160" w:line="360" w:lineRule="auto"/>
-        <w:jc w:val="center"/>
-        <w:rPr>
-          <w:rFonts w:hint="default"/>
-          <w:b/>
-          <w:sz w:val="32"/>
-          <w:szCs w:val="32"/>
-          <w:lang w:val="en-IN"/>
-        </w:rPr>
-      </w:pPr>
-    </w:p>
-    <w:p>
-      <w:pPr>
-        <w:widowControl/>
-        <w:tabs>
-          <w:tab w:val="left" w:pos="2832"/>
-          <w:tab w:val="center" w:pos="5059"/>
-        </w:tabs>
-        <w:spacing w:after="160" w:line="360" w:lineRule="auto"/>
-        <w:jc w:val="center"/>
-        <w:rPr>
-          <w:rFonts w:hint="default"/>
-          <w:b/>
-          <w:sz w:val="32"/>
-          <w:szCs w:val="32"/>
-          <w:lang w:val="en-IN"/>
-        </w:rPr>
-      </w:pPr>
-    </w:p>
-    <w:p>
-      <w:pPr>
-        <w:widowControl/>
-        <w:tabs>
-          <w:tab w:val="left" w:pos="2832"/>
-          <w:tab w:val="center" w:pos="5059"/>
-        </w:tabs>
-        <w:spacing w:after="160" w:line="360" w:lineRule="auto"/>
-        <w:jc w:val="center"/>
-        <w:rPr>
-          <w:rFonts w:hint="default"/>
-          <w:b/>
-          <w:sz w:val="32"/>
-          <w:szCs w:val="32"/>
-          <w:lang w:val="en-IN"/>
-        </w:rPr>
-      </w:pPr>
-    </w:p>
-    <w:p>
-      <w:pPr>
-        <w:widowControl/>
-        <w:tabs>
-          <w:tab w:val="left" w:pos="2832"/>
-          <w:tab w:val="center" w:pos="5059"/>
-        </w:tabs>
-        <w:spacing w:after="160" w:line="360" w:lineRule="auto"/>
-        <w:jc w:val="center"/>
-        <w:rPr>
-          <w:rFonts w:hint="default"/>
-          <w:b/>
-          <w:sz w:val="32"/>
-          <w:szCs w:val="32"/>
-          <w:lang w:val="en-IN"/>
-        </w:rPr>
-      </w:pPr>
-    </w:p>
-    <w:p>
-      <w:pPr>
-        <w:widowControl/>
-        <w:tabs>
-          <w:tab w:val="left" w:pos="2832"/>
-          <w:tab w:val="center" w:pos="5059"/>
-        </w:tabs>
-        <w:spacing w:after="160" w:line="360" w:lineRule="auto"/>
-        <w:jc w:val="center"/>
-        <w:rPr>
-          <w:rFonts w:hint="default"/>
-          <w:b/>
-          <w:sz w:val="32"/>
-          <w:szCs w:val="32"/>
-          <w:lang w:val="en-IN"/>
-        </w:rPr>
-      </w:pPr>
+      <w:bookmarkStart w:id="2" w:name="_GoBack"/>
+      <w:bookmarkEnd w:id="2"/>
     </w:p>
     <w:p>
       <w:pPr>
@@ -37990,7 +40813,7 @@
                     </pic:cNvPicPr>
                   </pic:nvPicPr>
                   <pic:blipFill>
-                    <a:blip r:embed="rId28"/>
+                    <a:blip r:embed="rId29"/>
                     <a:srcRect t="1175"/>
                     <a:stretch>
                       <a:fillRect/>
@@ -38087,7 +40910,7 @@
                     </pic:cNvPicPr>
                   </pic:nvPicPr>
                   <pic:blipFill>
-                    <a:blip r:embed="rId29"/>
+                    <a:blip r:embed="rId30"/>
                     <a:stretch>
                       <a:fillRect/>
                     </a:stretch>
@@ -38209,7 +41032,7 @@
                     </pic:cNvPicPr>
                   </pic:nvPicPr>
                   <pic:blipFill>
-                    <a:blip r:embed="rId30"/>
+                    <a:blip r:embed="rId31"/>
                     <a:srcRect t="1544" b="23183"/>
                     <a:stretch>
                       <a:fillRect/>
@@ -38230,8 +41053,6 @@
           </wp:inline>
         </w:drawing>
       </w:r>
-      <w:bookmarkStart w:id="2" w:name="_GoBack"/>
-      <w:bookmarkEnd w:id="2"/>
     </w:p>
     <w:p>
       <w:pPr>
@@ -38348,7 +41169,7 @@
                     </pic:cNvPicPr>
                   </pic:nvPicPr>
                   <pic:blipFill>
-                    <a:blip r:embed="rId31"/>
+                    <a:blip r:embed="rId32"/>
                     <a:stretch>
                       <a:fillRect/>
                     </a:stretch>
@@ -38414,6 +41235,22 @@
           <w:lang w:val="en-IN"/>
         </w:rPr>
       </w:pPr>
+    </w:p>
+    <w:p>
+      <w:pPr>
+        <w:widowControl/>
+        <w:spacing w:after="160" w:line="259" w:lineRule="auto"/>
+        <w:jc w:val="center"/>
+        <w:rPr>
+          <w:rFonts w:hint="default"/>
+          <w:b/>
+          <w:bCs/>
+          <w:iCs/>
+          <w:sz w:val="28"/>
+          <w:szCs w:val="28"/>
+          <w:lang w:val="en-IN"/>
+        </w:rPr>
+      </w:pPr>
       <w:r>
         <w:rPr>
           <w:rFonts w:hint="default"/>
@@ -38469,7 +41306,7 @@
                     </pic:cNvPicPr>
                   </pic:nvPicPr>
                   <pic:blipFill>
-                    <a:blip r:embed="rId32"/>
+                    <a:blip r:embed="rId33"/>
                     <a:stretch>
                       <a:fillRect/>
                     </a:stretch>
@@ -38575,7 +41412,7 @@
                     </pic:cNvPicPr>
                   </pic:nvPicPr>
                   <pic:blipFill>
-                    <a:blip r:embed="rId33"/>
+                    <a:blip r:embed="rId34"/>
                     <a:srcRect b="4830"/>
                     <a:stretch>
                       <a:fillRect/>
@@ -38682,7 +41519,7 @@
                     </pic:cNvPicPr>
                   </pic:nvPicPr>
                   <pic:blipFill>
-                    <a:blip r:embed="rId34"/>
+                    <a:blip r:embed="rId35"/>
                     <a:srcRect l="31414" r="29444"/>
                     <a:stretch>
                       <a:fillRect/>
@@ -38789,7 +41626,7 @@
                     </pic:cNvPicPr>
                   </pic:nvPicPr>
                   <pic:blipFill>
-                    <a:blip r:embed="rId35"/>
+                    <a:blip r:embed="rId36"/>
                     <a:srcRect l="31414" r="31559"/>
                     <a:stretch>
                       <a:fillRect/>
@@ -43414,7 +46251,7 @@
                     </pic:cNvPicPr>
                   </pic:nvPicPr>
                   <pic:blipFill>
-                    <a:blip r:embed="rId36"/>
+                    <a:blip r:embed="rId37"/>
                     <a:srcRect t="1792" r="298"/>
                     <a:stretch>
                       <a:fillRect/>
@@ -43847,7 +46684,7 @@
                     </pic:cNvPicPr>
                   </pic:nvPicPr>
                   <pic:blipFill>
-                    <a:blip r:embed="rId37"/>
+                    <a:blip r:embed="rId38"/>
                     <a:srcRect t="3575"/>
                     <a:stretch>
                       <a:fillRect/>
@@ -43936,7 +46773,7 @@
                     </pic:cNvPicPr>
                   </pic:nvPicPr>
                   <pic:blipFill>
-                    <a:blip r:embed="rId38"/>
+                    <a:blip r:embed="rId39"/>
                     <a:stretch>
                       <a:fillRect/>
                     </a:stretch>
@@ -44130,22 +46967,6 @@
                       <a:ln w="6350">
                         <a:noFill/>
                       </a:ln>
-                      <a:extLst>
-                        <a:ext uri="{909E8E84-426E-40DD-AFC4-6F175D3DCCD1}">
-                          <a14:hiddenFill xmlns:a14="http://schemas.microsoft.com/office/drawing/2010/main">
-                            <a:solidFill>
-                              <a:schemeClr val="lt1"/>
-                            </a:solidFill>
-                          </a14:hiddenFill>
-                        </a:ext>
-                        <a:ext uri="{91240B29-F687-4F45-9708-019B960494DF}">
-                          <a14:hiddenLine xmlns:a14="http://schemas.microsoft.com/office/drawing/2010/main" w="6350">
-                            <a:solidFill>
-                              <a:prstClr val="black"/>
-                            </a:solidFill>
-                          </a14:hiddenLine>
-                        </a:ext>
-                      </a:extLst>
                     </wps:spPr>
                     <wps:style>
                       <a:lnRef idx="0">
@@ -44196,7 +47017,7 @@
         </mc:Choice>
         <mc:Fallback>
           <w:pict>
-            <v:shape id="_x0000_s1026" o:spid="_x0000_s1026" o:spt="202" type="#_x0000_t202" style="position:absolute;left:0pt;margin-top:0pt;height:144pt;width:144pt;mso-position-horizontal:right;mso-position-horizontal-relative:margin;mso-wrap-style:none;z-index:251659264;mso-width-relative:page;mso-height-relative:page;" filled="f" stroked="f" coordsize="21600,21600" o:gfxdata="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">
+            <v:shape id="_x0000_s1026" o:spid="_x0000_s1026" o:spt="202" type="#_x0000_t202" style="position:absolute;left:0pt;margin-top:0pt;height:144pt;width:144pt;mso-position-horizontal:right;mso-position-horizontal-relative:margin;mso-wrap-style:none;z-index:251659264;mso-width-relative:page;mso-height-relative:page;" filled="f" stroked="f" coordsize="21600,21600" o:gfxdata="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">
               <v:fill on="f" focussize="0,0"/>
               <v:stroke on="f" weight="0.5pt"/>
               <v:imagedata o:title=""/>

</xml_diff>